<commit_message>
creating GPOs and joining client machine into the DC domain
</commit_message>
<xml_diff>
--- a/New Microsoft Word Document.docx
+++ b/New Microsoft Word Document.docx
@@ -4,13 +4,17 @@
   <w:body>
     <w:p>
       <w:r>
-        <w:t xml:space="preserve">1 Install active directory and create user and group here we </w:t>
-      </w:r>
-      <w:proofErr w:type="gramStart"/>
-      <w:r>
-        <w:t>used</w:t>
-      </w:r>
-      <w:proofErr w:type="gramEnd"/>
+        <w:t>1 Install active directory and create user and group</w:t>
+      </w:r>
+      <w:r>
+        <w:t>,</w:t>
+      </w:r>
+      <w:r>
+        <w:t xml:space="preserve"> here we </w:t>
+      </w:r>
+      <w:r>
+        <w:t>use</w:t>
+      </w:r>
       <w:r>
         <w:t xml:space="preserve"> active directory </w:t>
       </w:r>
@@ -32,21 +36,7 @@
           <w:rPr>
             <w:rStyle w:val="Hyperlink"/>
           </w:rPr>
-          <w:t xml:space="preserve">Installing Active Directory on Windows </w:t>
-        </w:r>
-        <w:proofErr w:type="gramStart"/>
-        <w:r>
-          <w:rPr>
-            <w:rStyle w:val="Hyperlink"/>
-          </w:rPr>
-          <w:t>Server on</w:t>
-        </w:r>
-        <w:proofErr w:type="gramEnd"/>
-        <w:r>
-          <w:rPr>
-            <w:rStyle w:val="Hyperlink"/>
-          </w:rPr>
-          <w:t xml:space="preserve"> Virtual Machine (Home Lab) (Ep. 1)</w:t>
+          <w:t>Installing Active Directory on Windows Server on Virtual Machine (Home Lab) (Ep. 1)</w:t>
         </w:r>
       </w:hyperlink>
     </w:p>
@@ -65,13 +55,8 @@
     </w:p>
     <w:p>
       <w:r>
-        <w:t xml:space="preserve">COMPUTER CONFIGURATIONS vs User </w:t>
-      </w:r>
-      <w:proofErr w:type="spellStart"/>
-      <w:r>
-        <w:t>Conficurations</w:t>
-      </w:r>
-      <w:proofErr w:type="spellEnd"/>
+        <w:t>COMPUTER CONFIGURATIONS vs User Conficurations</w:t>
+      </w:r>
     </w:p>
     <w:p>
       <w:hyperlink r:id="rId6" w:history="1">
@@ -91,88 +76,481 @@
         <w:t>s preferences.</w:t>
       </w:r>
     </w:p>
-    <w:p/>
-    <w:p/>
-    <w:p/>
-    <w:p/>
-    <w:p/>
+    <w:p>
+      <w:r>
+        <w:t>nslook</w:t>
+      </w:r>
+    </w:p>
     <w:p>
       <w:hyperlink r:id="rId7" w:history="1">
         <w:r>
           <w:rPr>
             <w:rStyle w:val="Hyperlink"/>
           </w:rPr>
-          <w:t xml:space="preserve">Installing Active Directory on Windows </w:t>
-        </w:r>
-        <w:proofErr w:type="gramStart"/>
-        <w:r>
-          <w:rPr>
-            <w:rStyle w:val="Hyperlink"/>
-          </w:rPr>
-          <w:t>Server on</w:t>
-        </w:r>
-        <w:proofErr w:type="gramEnd"/>
-        <w:r>
-          <w:rPr>
-            <w:rStyle w:val="Hyperlink"/>
-          </w:rPr>
-          <w:t xml:space="preserve"> Virtual Machine (Home Lab) (Ep. 1)</w:t>
+          <w:t>Installing Active Directory on Windows Server on Virtual Machine (Home Lab) (Ep. 1)</w:t>
         </w:r>
       </w:hyperlink>
     </w:p>
     <w:p>
       <w:r>
-        <w:t xml:space="preserve">In active directory Computers and </w:t>
-      </w:r>
-      <w:r>
-        <w:t>users,</w:t>
+        <w:t>Creating a Password Policy</w:t>
+      </w:r>
+      <w:r>
+        <w:t>:</w:t>
+      </w:r>
+    </w:p>
+    <w:p>
+      <w:r>
+        <w:t xml:space="preserve">In </w:t>
+      </w:r>
+      <w:r>
+        <w:t>group policy managment</w:t>
+      </w:r>
+      <w:r>
+        <w:t>,</w:t>
       </w:r>
       <w:r>
         <w:t xml:space="preserve"> create under the Domain a new </w:t>
       </w:r>
-      <w:proofErr w:type="gramStart"/>
-      <w:r>
-        <w:t>GPO ,</w:t>
-      </w:r>
-      <w:proofErr w:type="gramEnd"/>
+      <w:r>
+        <w:t>GPO,</w:t>
+      </w:r>
       <w:r>
         <w:t xml:space="preserve"> then edit it </w:t>
+      </w:r>
+    </w:p>
+    <w:p>
+      <w:r>
+        <w:t xml:space="preserve">Then go to Computer configuration </w:t>
+      </w:r>
+      <w:r>
+        <w:t>-</w:t>
+      </w:r>
+      <w:r>
+        <w:t>&gt; Policies -&gt; windows Settings -&gt; security settings -&gt; Account Policies -&gt; password Policy -&gt; choose which policy and enable it.</w:t>
+      </w:r>
+    </w:p>
+    <w:p>
+      <w:r>
+        <w:drawing>
+          <wp:inline distT="0" distB="0" distL="0" distR="0" wp14:anchorId="2E5B0E3D" wp14:editId="104F80C5">
+            <wp:extent cx="5943600" cy="3803015"/>
+            <wp:effectExtent l="0" t="0" r="0" b="6985"/>
+            <wp:docPr id="906245398" name="Picture 1" descr="A screenshot of a computer&#10;&#10;AI-generated content may be incorrect."/>
+            <wp:cNvGraphicFramePr>
+              <a:graphicFrameLocks xmlns:a="http://schemas.openxmlformats.org/drawingml/2006/main" noChangeAspect="1"/>
+            </wp:cNvGraphicFramePr>
+            <a:graphic xmlns:a="http://schemas.openxmlformats.org/drawingml/2006/main">
+              <a:graphicData uri="http://schemas.openxmlformats.org/drawingml/2006/picture">
+                <pic:pic xmlns:pic="http://schemas.openxmlformats.org/drawingml/2006/picture">
+                  <pic:nvPicPr>
+                    <pic:cNvPr id="906245398" name="Picture 1" descr="A screenshot of a computer&#10;&#10;AI-generated content may be incorrect."/>
+                    <pic:cNvPicPr/>
+                  </pic:nvPicPr>
+                  <pic:blipFill>
+                    <a:blip r:embed="rId8"/>
+                    <a:stretch>
+                      <a:fillRect/>
+                    </a:stretch>
+                  </pic:blipFill>
+                  <pic:spPr>
+                    <a:xfrm>
+                      <a:off x="0" y="0"/>
+                      <a:ext cx="5943600" cy="3803015"/>
+                    </a:xfrm>
+                    <a:prstGeom prst="rect">
+                      <a:avLst/>
+                    </a:prstGeom>
+                  </pic:spPr>
+                </pic:pic>
+              </a:graphicData>
+            </a:graphic>
+          </wp:inline>
+        </w:drawing>
+      </w:r>
+    </w:p>
+    <w:p/>
+    <w:p>
+      <w:r>
+        <w:lastRenderedPageBreak/>
+        <w:t>Creating Drive Mapping:</w:t>
+      </w:r>
+    </w:p>
+    <w:p>
+      <w:r>
+        <w:t xml:space="preserve">In group policy managment, create under the Domain a new GPO, then edit it </w:t>
+      </w:r>
+    </w:p>
+    <w:p>
+      <w:r>
+        <w:t xml:space="preserve">Then go </w:t>
+      </w:r>
+      <w:r>
+        <w:t>User Configuration -&gt; preferences -&gt; windows settings -&gt; Drive Maps &gt; create the file mapping and select the shared folder and assign a drive for it</w:t>
+      </w:r>
+    </w:p>
+    <w:p>
+      <w:r>
+        <w:drawing>
+          <wp:inline distT="0" distB="0" distL="0" distR="0" wp14:anchorId="1793F8F1" wp14:editId="3A4FC819">
+            <wp:extent cx="5943600" cy="4304665"/>
+            <wp:effectExtent l="0" t="0" r="0" b="635"/>
+            <wp:docPr id="1924124388" name="Picture 1" descr="A screenshot of a computer&#10;&#10;AI-generated content may be incorrect."/>
+            <wp:cNvGraphicFramePr>
+              <a:graphicFrameLocks xmlns:a="http://schemas.openxmlformats.org/drawingml/2006/main" noChangeAspect="1"/>
+            </wp:cNvGraphicFramePr>
+            <a:graphic xmlns:a="http://schemas.openxmlformats.org/drawingml/2006/main">
+              <a:graphicData uri="http://schemas.openxmlformats.org/drawingml/2006/picture">
+                <pic:pic xmlns:pic="http://schemas.openxmlformats.org/drawingml/2006/picture">
+                  <pic:nvPicPr>
+                    <pic:cNvPr id="1924124388" name="Picture 1" descr="A screenshot of a computer&#10;&#10;AI-generated content may be incorrect."/>
+                    <pic:cNvPicPr/>
+                  </pic:nvPicPr>
+                  <pic:blipFill>
+                    <a:blip r:embed="rId9"/>
+                    <a:stretch>
+                      <a:fillRect/>
+                    </a:stretch>
+                  </pic:blipFill>
+                  <pic:spPr>
+                    <a:xfrm>
+                      <a:off x="0" y="0"/>
+                      <a:ext cx="5943600" cy="4304665"/>
+                    </a:xfrm>
+                    <a:prstGeom prst="rect">
+                      <a:avLst/>
+                    </a:prstGeom>
+                  </pic:spPr>
+                </pic:pic>
+              </a:graphicData>
+            </a:graphic>
+          </wp:inline>
+        </w:drawing>
+      </w:r>
+    </w:p>
+    <w:p/>
+    <w:p/>
+    <w:p>
+      <w:r>
+        <w:t xml:space="preserve">Create a default wallpaper: </w:t>
+      </w:r>
+    </w:p>
+    <w:p>
+      <w:r>
+        <w:t xml:space="preserve">In group policy managment, create under the Domain a new GPO, then edit it </w:t>
+      </w:r>
+    </w:p>
+    <w:p>
+      <w:r>
+        <w:t xml:space="preserve">Then go to User Configuration -&gt; </w:t>
+      </w:r>
+      <w:r>
+        <w:t>Policy Configurations</w:t>
+      </w:r>
+      <w:r>
+        <w:t xml:space="preserve"> -&gt; </w:t>
+      </w:r>
+      <w:r>
+        <w:t>administrative templates</w:t>
+      </w:r>
+      <w:r>
+        <w:t xml:space="preserve"> -&gt; </w:t>
+      </w:r>
+      <w:r>
+        <w:t>desktop</w:t>
+      </w:r>
+      <w:r>
+        <w:t xml:space="preserve"> </w:t>
+      </w:r>
+      <w:r>
+        <w:t>-</w:t>
+      </w:r>
+      <w:r>
+        <w:t>&gt;</w:t>
+      </w:r>
+      <w:r>
+        <w:t xml:space="preserve"> -&gt; desktop wallpaper -&gt;</w:t>
+      </w:r>
+      <w:r>
+        <w:t xml:space="preserve"> </w:t>
+      </w:r>
+      <w:r>
+        <w:t>put the path to the default wallpaper then enable then apply and ok</w:t>
+      </w:r>
+    </w:p>
+    <w:p>
+      <w:r>
+        <w:lastRenderedPageBreak/>
+        <w:drawing>
+          <wp:inline distT="0" distB="0" distL="0" distR="0" wp14:anchorId="6D80746D" wp14:editId="5DF26C26">
+            <wp:extent cx="5943600" cy="3997325"/>
+            <wp:effectExtent l="0" t="0" r="0" b="3175"/>
+            <wp:docPr id="480396388" name="Picture 1" descr="A screenshot of a computer&#10;&#10;AI-generated content may be incorrect."/>
+            <wp:cNvGraphicFramePr>
+              <a:graphicFrameLocks xmlns:a="http://schemas.openxmlformats.org/drawingml/2006/main" noChangeAspect="1"/>
+            </wp:cNvGraphicFramePr>
+            <a:graphic xmlns:a="http://schemas.openxmlformats.org/drawingml/2006/main">
+              <a:graphicData uri="http://schemas.openxmlformats.org/drawingml/2006/picture">
+                <pic:pic xmlns:pic="http://schemas.openxmlformats.org/drawingml/2006/picture">
+                  <pic:nvPicPr>
+                    <pic:cNvPr id="480396388" name="Picture 1" descr="A screenshot of a computer&#10;&#10;AI-generated content may be incorrect."/>
+                    <pic:cNvPicPr/>
+                  </pic:nvPicPr>
+                  <pic:blipFill>
+                    <a:blip r:embed="rId10"/>
+                    <a:stretch>
+                      <a:fillRect/>
+                    </a:stretch>
+                  </pic:blipFill>
+                  <pic:spPr>
+                    <a:xfrm>
+                      <a:off x="0" y="0"/>
+                      <a:ext cx="5943600" cy="3997325"/>
+                    </a:xfrm>
+                    <a:prstGeom prst="rect">
+                      <a:avLst/>
+                    </a:prstGeom>
+                  </pic:spPr>
+                </pic:pic>
+              </a:graphicData>
+            </a:graphic>
+          </wp:inline>
+        </w:drawing>
       </w:r>
     </w:p>
     <w:p/>
     <w:p/>
     <w:p/>
+    <w:p>
+      <w:r>
+        <w:t>Account lockout Policy: to prevent:</w:t>
+      </w:r>
+    </w:p>
+    <w:p>
+      <w:r>
+        <w:t xml:space="preserve">In group policy managment, create under the Domain a new GPO, then edit it </w:t>
+      </w:r>
+    </w:p>
+    <w:p>
+      <w:r>
+        <w:t>Then go to Computer configuration -&gt; Policies -&gt; windows Settings -&gt; security settings -&gt; Account lockout Policy</w:t>
+      </w:r>
+      <w:r>
+        <w:t xml:space="preserve"> </w:t>
+      </w:r>
+      <w:r>
+        <w:t xml:space="preserve">-&gt; Account </w:t>
+      </w:r>
+      <w:r>
+        <w:t>L</w:t>
+      </w:r>
+      <w:r>
+        <w:t xml:space="preserve">ockout </w:t>
+      </w:r>
+      <w:r>
+        <w:t>Threshold</w:t>
+      </w:r>
+      <w:r>
+        <w:t xml:space="preserve">-&gt; choose </w:t>
+      </w:r>
+      <w:r>
+        <w:t>the max</w:t>
+      </w:r>
+      <w:r>
+        <w:t xml:space="preserve"> </w:t>
+      </w:r>
+      <w:r>
+        <w:t xml:space="preserve">number of tries do you want </w:t>
+      </w:r>
+      <w:r>
+        <w:t>.</w:t>
+      </w:r>
+    </w:p>
+    <w:p/>
+    <w:p>
+      <w:r>
+        <w:lastRenderedPageBreak/>
+        <w:drawing>
+          <wp:inline distT="0" distB="0" distL="0" distR="0" wp14:anchorId="7B7C7275" wp14:editId="4BAB4B56">
+            <wp:extent cx="5943600" cy="4117340"/>
+            <wp:effectExtent l="0" t="0" r="0" b="0"/>
+            <wp:docPr id="1820303031" name="Picture 1" descr="A screenshot of a computer&#10;&#10;AI-generated content may be incorrect."/>
+            <wp:cNvGraphicFramePr>
+              <a:graphicFrameLocks xmlns:a="http://schemas.openxmlformats.org/drawingml/2006/main" noChangeAspect="1"/>
+            </wp:cNvGraphicFramePr>
+            <a:graphic xmlns:a="http://schemas.openxmlformats.org/drawingml/2006/main">
+              <a:graphicData uri="http://schemas.openxmlformats.org/drawingml/2006/picture">
+                <pic:pic xmlns:pic="http://schemas.openxmlformats.org/drawingml/2006/picture">
+                  <pic:nvPicPr>
+                    <pic:cNvPr id="1820303031" name="Picture 1" descr="A screenshot of a computer&#10;&#10;AI-generated content may be incorrect."/>
+                    <pic:cNvPicPr/>
+                  </pic:nvPicPr>
+                  <pic:blipFill>
+                    <a:blip r:embed="rId11"/>
+                    <a:stretch>
+                      <a:fillRect/>
+                    </a:stretch>
+                  </pic:blipFill>
+                  <pic:spPr>
+                    <a:xfrm>
+                      <a:off x="0" y="0"/>
+                      <a:ext cx="5943600" cy="4117340"/>
+                    </a:xfrm>
+                    <a:prstGeom prst="rect">
+                      <a:avLst/>
+                    </a:prstGeom>
+                  </pic:spPr>
+                </pic:pic>
+              </a:graphicData>
+            </a:graphic>
+          </wp:inline>
+        </w:drawing>
+      </w:r>
+    </w:p>
+    <w:p>
+      <w:r>
+        <w:drawing>
+          <wp:inline distT="0" distB="0" distL="0" distR="0" wp14:anchorId="4EB3D630" wp14:editId="190A1B39">
+            <wp:extent cx="5943600" cy="3875405"/>
+            <wp:effectExtent l="0" t="0" r="0" b="0"/>
+            <wp:docPr id="28098487" name="Picture 1" descr="A screenshot of a computer&#10;&#10;AI-generated content may be incorrect."/>
+            <wp:cNvGraphicFramePr>
+              <a:graphicFrameLocks xmlns:a="http://schemas.openxmlformats.org/drawingml/2006/main" noChangeAspect="1"/>
+            </wp:cNvGraphicFramePr>
+            <a:graphic xmlns:a="http://schemas.openxmlformats.org/drawingml/2006/main">
+              <a:graphicData uri="http://schemas.openxmlformats.org/drawingml/2006/picture">
+                <pic:pic xmlns:pic="http://schemas.openxmlformats.org/drawingml/2006/picture">
+                  <pic:nvPicPr>
+                    <pic:cNvPr id="28098487" name="Picture 1" descr="A screenshot of a computer&#10;&#10;AI-generated content may be incorrect."/>
+                    <pic:cNvPicPr/>
+                  </pic:nvPicPr>
+                  <pic:blipFill>
+                    <a:blip r:embed="rId12"/>
+                    <a:stretch>
+                      <a:fillRect/>
+                    </a:stretch>
+                  </pic:blipFill>
+                  <pic:spPr>
+                    <a:xfrm>
+                      <a:off x="0" y="0"/>
+                      <a:ext cx="5943600" cy="3875405"/>
+                    </a:xfrm>
+                    <a:prstGeom prst="rect">
+                      <a:avLst/>
+                    </a:prstGeom>
+                  </pic:spPr>
+                </pic:pic>
+              </a:graphicData>
+            </a:graphic>
+          </wp:inline>
+        </w:drawing>
+      </w:r>
+    </w:p>
+    <w:p/>
+    <w:p>
+      <w:r>
+        <w:t>AD DS ACTIVE Directorz domain server</w:t>
+      </w:r>
+    </w:p>
+    <w:p>
+      <w:r>
+        <w:t xml:space="preserve">GPO group policy </w:t>
+      </w:r>
+      <w:r>
+        <w:t>management</w:t>
+      </w:r>
+    </w:p>
+    <w:p>
+      <w:r>
+        <w:t>OU organizational Unit</w:t>
+      </w:r>
+    </w:p>
+    <w:p>
+      <w:r>
+        <w:t>GPMC group policy management console</w:t>
+      </w:r>
+    </w:p>
     <w:p/>
     <w:p/>
     <w:p>
       <w:r>
-        <w:t xml:space="preserve">AD DS ACTIVE </w:t>
-      </w:r>
-      <w:proofErr w:type="spellStart"/>
-      <w:r>
-        <w:t>Directorz</w:t>
-      </w:r>
-      <w:proofErr w:type="spellEnd"/>
-      <w:r>
-        <w:t xml:space="preserve"> domain server</w:t>
-      </w:r>
-    </w:p>
-    <w:p>
-      <w:r>
-        <w:t xml:space="preserve">GPO group policy </w:t>
-      </w:r>
-      <w:r>
-        <w:t>management</w:t>
-      </w:r>
-    </w:p>
-    <w:p>
-      <w:r>
-        <w:t>OU organizational Unit</w:t>
-      </w:r>
-    </w:p>
-    <w:p>
-      <w:r>
-        <w:t>GPMC group policy management console</w:t>
+        <w:t>Joining Domain&gt;</w:t>
+      </w:r>
+    </w:p>
+    <w:p>
+      <w:r>
+        <w:t>Create a VM with windows enterprise installed in it.</w:t>
+      </w:r>
+    </w:p>
+    <w:p>
+      <w:r>
+        <w:t>Make the server machin</w:t>
+      </w:r>
+      <w:r>
+        <w:t>e</w:t>
+      </w:r>
+      <w:r>
+        <w:t xml:space="preserve"> a static IP </w:t>
+      </w:r>
+      <w:r>
+        <w:t>address in the Ethernet configuration.</w:t>
+      </w:r>
+    </w:p>
+    <w:p>
+      <w:r>
+        <w:t xml:space="preserve">Use ipconfig </w:t>
+      </w:r>
+      <w:r>
+        <w:t>/all to s</w:t>
+      </w:r>
+      <w:r>
+        <w:t xml:space="preserve">ee all the details about the IP address, default gateway , </w:t>
+      </w:r>
+    </w:p>
+    <w:p>
+      <w:r>
+        <w:t>On the client machine in the Ethernet config, keep the DHCP enabled, but in the DNS put it the same Static IP address of the server machine.</w:t>
+      </w:r>
+    </w:p>
+    <w:p>
+      <w:r>
+        <w:t>Then ping the same IP address to make sure everything works fine.</w:t>
+      </w:r>
+    </w:p>
+    <w:p/>
+    <w:p>
+      <w:r>
+        <w:t>Ncpa.cpl in cmd</w:t>
+      </w:r>
+    </w:p>
+    <w:p/>
+    <w:p>
+      <w:r>
+        <w:t xml:space="preserve">Put the dns on the client the same static ip as the DC ip adresse </w:t>
+      </w:r>
+    </w:p>
+    <w:p>
+      <w:r>
+        <w:t>Open DNS manager from serv</w:t>
+      </w:r>
+      <w:r>
+        <w:t>er manager , open the domain.local and add new a or aaaa record , leave the name empty and the ip address the same as the dc static server.</w:t>
+      </w:r>
+    </w:p>
+    <w:p>
+      <w:r>
+        <w:t>Then properties then all Ip adresses</w:t>
+      </w:r>
+    </w:p>
+    <w:p>
+      <w:r>
+        <w:t xml:space="preserve">Also on the server put the </w:t>
+      </w:r>
+      <w:r>
+        <w:t>DNS</w:t>
+      </w:r>
+      <w:r>
+        <w:t xml:space="preserve"> server on 127.0.0.1</w:t>
       </w:r>
     </w:p>
     <w:sectPr>
@@ -682,6 +1060,7 @@
   <w:style w:type="paragraph" w:default="1" w:styleId="Normal">
     <w:name w:val="Normal"/>
     <w:qFormat/>
+    <w:rsid w:val="001B0290"/>
   </w:style>
   <w:style w:type="paragraph" w:styleId="Heading1">
     <w:name w:val="heading 1"/>
@@ -885,7 +1264,6 @@
   <w:style w:type="character" w:default="1" w:styleId="DefaultParagraphFont">
     <w:name w:val="Default Paragraph Font"/>
     <w:uiPriority w:val="1"/>
-    <w:semiHidden/>
     <w:unhideWhenUsed/>
   </w:style>
   <w:style w:type="table" w:default="1" w:styleId="TableNormal">

</xml_diff>

<commit_message>
file sharing , Mapping
</commit_message>
<xml_diff>
--- a/New Microsoft Word Document.docx
+++ b/New Microsoft Word Document.docx
@@ -132,6 +132,9 @@
     </w:p>
     <w:p>
       <w:r>
+        <w:rPr>
+          <w:noProof/>
+        </w:rPr>
         <w:drawing>
           <wp:inline distT="0" distB="0" distL="0" distR="0" wp14:anchorId="2E5B0E3D" wp14:editId="104F80C5">
             <wp:extent cx="5943600" cy="3803015"/>
@@ -191,6 +194,9 @@
     </w:p>
     <w:p>
       <w:r>
+        <w:rPr>
+          <w:noProof/>
+        </w:rPr>
         <w:drawing>
           <wp:inline distT="0" distB="0" distL="0" distR="0" wp14:anchorId="1793F8F1" wp14:editId="3A4FC819">
             <wp:extent cx="5943600" cy="4304665"/>
@@ -280,6 +286,9 @@
     </w:p>
     <w:p>
       <w:r>
+        <w:rPr>
+          <w:noProof/>
+        </w:rPr>
         <w:lastRenderedPageBreak/>
         <w:drawing>
           <wp:inline distT="0" distB="0" distL="0" distR="0" wp14:anchorId="6D80746D" wp14:editId="5DF26C26">
@@ -333,33 +342,27 @@
     </w:p>
     <w:p>
       <w:r>
-        <w:t>Then go to Computer configuration -&gt; Policies -&gt; windows Settings -&gt; security settings -&gt; Account lockout Policy</w:t>
+        <w:t xml:space="preserve">Then go to Computer configuration -&gt; Policies -&gt; windows Settings -&gt; security settings -&gt; Account lockout Policy -&gt; Account </w:t>
+      </w:r>
+      <w:r>
+        <w:t>L</w:t>
+      </w:r>
+      <w:r>
+        <w:t xml:space="preserve">ockout </w:t>
+      </w:r>
+      <w:r>
+        <w:t>Threshold</w:t>
+      </w:r>
+      <w:r>
+        <w:t xml:space="preserve">-&gt; choose </w:t>
+      </w:r>
+      <w:r>
+        <w:t>the max</w:t>
       </w:r>
       <w:r>
         <w:t xml:space="preserve"> </w:t>
       </w:r>
       <w:r>
-        <w:t xml:space="preserve">-&gt; Account </w:t>
-      </w:r>
-      <w:r>
-        <w:t>L</w:t>
-      </w:r>
-      <w:r>
-        <w:t xml:space="preserve">ockout </w:t>
-      </w:r>
-      <w:r>
-        <w:t>Threshold</w:t>
-      </w:r>
-      <w:r>
-        <w:t xml:space="preserve">-&gt; choose </w:t>
-      </w:r>
-      <w:r>
-        <w:t>the max</w:t>
-      </w:r>
-      <w:r>
-        <w:t xml:space="preserve"> </w:t>
-      </w:r>
-      <w:r>
         <w:t xml:space="preserve">number of tries do you want </w:t>
       </w:r>
       <w:r>
@@ -369,6 +372,9 @@
     <w:p/>
     <w:p>
       <w:r>
+        <w:rPr>
+          <w:noProof/>
+        </w:rPr>
         <w:lastRenderedPageBreak/>
         <w:drawing>
           <wp:inline distT="0" distB="0" distL="0" distR="0" wp14:anchorId="7B7C7275" wp14:editId="4BAB4B56">
@@ -409,6 +415,9 @@
     </w:p>
     <w:p>
       <w:r>
+        <w:rPr>
+          <w:noProof/>
+        </w:rPr>
         <w:drawing>
           <wp:inline distT="0" distB="0" distL="0" distR="0" wp14:anchorId="4EB3D630" wp14:editId="190A1B39">
             <wp:extent cx="5943600" cy="3875405"/>
@@ -449,7 +458,13 @@
     <w:p/>
     <w:p>
       <w:r>
-        <w:t>AD DS ACTIVE Directorz domain server</w:t>
+        <w:t>AD DS ACTIVE Director</w:t>
+      </w:r>
+      <w:r>
+        <w:t>y</w:t>
+      </w:r>
+      <w:r>
+        <w:t xml:space="preserve"> domain server</w:t>
       </w:r>
     </w:p>
     <w:p>
@@ -504,7 +519,13 @@
         <w:t>/all to s</w:t>
       </w:r>
       <w:r>
-        <w:t xml:space="preserve">ee all the details about the IP address, default gateway , </w:t>
+        <w:t xml:space="preserve">ee all the details about the IP address, default </w:t>
+      </w:r>
+      <w:r>
+        <w:t>gateway,</w:t>
+      </w:r>
+      <w:r>
+        <w:t xml:space="preserve"> </w:t>
       </w:r>
     </w:p>
     <w:p>
@@ -534,23 +555,349 @@
         <w:t>Open DNS manager from serv</w:t>
       </w:r>
       <w:r>
-        <w:t>er manager , open the domain.local and add new a or aaaa record , leave the name empty and the ip address the same as the dc static server.</w:t>
-      </w:r>
-    </w:p>
-    <w:p>
-      <w:r>
-        <w:t>Then properties then all Ip adresses</w:t>
-      </w:r>
-    </w:p>
-    <w:p>
-      <w:r>
-        <w:t xml:space="preserve">Also on the server put the </w:t>
+        <w:t xml:space="preserve">er </w:t>
+      </w:r>
+      <w:r>
+        <w:t>manager,</w:t>
+      </w:r>
+      <w:r>
+        <w:t xml:space="preserve"> open the domain.local and add new a or aaaa record , leave the name empty and the ip address the same as the dc static server.</w:t>
+      </w:r>
+    </w:p>
+    <w:p>
+      <w:r>
+        <w:t xml:space="preserve">Then properties then all Ip </w:t>
+      </w:r>
+      <w:r>
+        <w:t>addresses</w:t>
+      </w:r>
+    </w:p>
+    <w:p>
+      <w:r>
+        <w:t>Also,</w:t>
+      </w:r>
+      <w:r>
+        <w:t xml:space="preserve"> on the server put the </w:t>
       </w:r>
       <w:r>
         <w:t>DNS</w:t>
       </w:r>
       <w:r>
         <w:t xml:space="preserve"> server on 127.0.0.1</w:t>
+      </w:r>
+    </w:p>
+    <w:p/>
+    <w:p/>
+    <w:p/>
+    <w:p/>
+    <w:p/>
+    <w:p>
+      <w:r>
+        <w:lastRenderedPageBreak/>
+        <w:t>Enabling and forcing GPO:</w:t>
+      </w:r>
+    </w:p>
+    <w:p>
+      <w:r>
+        <w:t>Example:</w:t>
+      </w:r>
+      <w:r>
+        <w:t xml:space="preserve"> create a Policy to prevent access to control panel.</w:t>
+      </w:r>
+    </w:p>
+    <w:p>
+      <w:pPr>
+        <w:pStyle w:val="ListParagraph"/>
+        <w:numPr>
+          <w:ilvl w:val="0"/>
+          <w:numId w:val="2"/>
+        </w:numPr>
+      </w:pPr>
+      <w:r>
+        <w:t xml:space="preserve">Then go User Configuration -&gt; </w:t>
+      </w:r>
+      <w:r>
+        <w:t>policies</w:t>
+      </w:r>
+      <w:r>
+        <w:t xml:space="preserve"> -&gt; </w:t>
+      </w:r>
+      <w:r>
+        <w:t xml:space="preserve">control panel </w:t>
+      </w:r>
+      <w:r>
+        <w:t xml:space="preserve"> -&gt; </w:t>
+      </w:r>
+      <w:r>
+        <w:t>Admin Templates</w:t>
+      </w:r>
+      <w:r>
+        <w:t xml:space="preserve">&gt; </w:t>
+      </w:r>
+      <w:r>
+        <w:t>prohibit access to control panel and PC settings.</w:t>
+      </w:r>
+    </w:p>
+    <w:p>
+      <w:pPr>
+        <w:pStyle w:val="ListParagraph"/>
+        <w:numPr>
+          <w:ilvl w:val="0"/>
+          <w:numId w:val="2"/>
+        </w:numPr>
+      </w:pPr>
+      <w:r>
+        <w:t>Add the policy into the Users OU in Group Policy management.</w:t>
+      </w:r>
+    </w:p>
+    <w:p>
+      <w:pPr>
+        <w:pStyle w:val="ListParagraph"/>
+      </w:pPr>
+      <w:r>
+        <w:drawing>
+          <wp:inline distT="0" distB="0" distL="0" distR="0" wp14:anchorId="44C064E1" wp14:editId="4F721127">
+            <wp:extent cx="4768664" cy="2724150"/>
+            <wp:effectExtent l="0" t="0" r="0" b="0"/>
+            <wp:docPr id="177082586" name="Picture 1" descr="A screenshot of a computer&#10;&#10;AI-generated content may be incorrect."/>
+            <wp:cNvGraphicFramePr>
+              <a:graphicFrameLocks xmlns:a="http://schemas.openxmlformats.org/drawingml/2006/main" noChangeAspect="1"/>
+            </wp:cNvGraphicFramePr>
+            <a:graphic xmlns:a="http://schemas.openxmlformats.org/drawingml/2006/main">
+              <a:graphicData uri="http://schemas.openxmlformats.org/drawingml/2006/picture">
+                <pic:pic xmlns:pic="http://schemas.openxmlformats.org/drawingml/2006/picture">
+                  <pic:nvPicPr>
+                    <pic:cNvPr id="177082586" name="Picture 1" descr="A screenshot of a computer&#10;&#10;AI-generated content may be incorrect."/>
+                    <pic:cNvPicPr/>
+                  </pic:nvPicPr>
+                  <pic:blipFill>
+                    <a:blip r:embed="rId13"/>
+                    <a:stretch>
+                      <a:fillRect/>
+                    </a:stretch>
+                  </pic:blipFill>
+                  <pic:spPr>
+                    <a:xfrm>
+                      <a:off x="0" y="0"/>
+                      <a:ext cx="4774527" cy="2727499"/>
+                    </a:xfrm>
+                    <a:prstGeom prst="rect">
+                      <a:avLst/>
+                    </a:prstGeom>
+                  </pic:spPr>
+                </pic:pic>
+              </a:graphicData>
+            </a:graphic>
+          </wp:inline>
+        </w:drawing>
+      </w:r>
+    </w:p>
+    <w:p/>
+    <w:p>
+      <w:pPr>
+        <w:pStyle w:val="ListParagraph"/>
+        <w:numPr>
+          <w:ilvl w:val="0"/>
+          <w:numId w:val="2"/>
+        </w:numPr>
+      </w:pPr>
+      <w:r>
+        <w:t>Then on client PC open terminal and type gpupdate /force</w:t>
+      </w:r>
+    </w:p>
+    <w:p>
+      <w:pPr>
+        <w:pStyle w:val="ListParagraph"/>
+        <w:numPr>
+          <w:ilvl w:val="0"/>
+          <w:numId w:val="2"/>
+        </w:numPr>
+      </w:pPr>
+      <w:r>
+        <w:t>Now client machine can’t have access to control panel</w:t>
+      </w:r>
+    </w:p>
+    <w:p>
+      <w:pPr>
+        <w:pStyle w:val="ListParagraph"/>
+      </w:pPr>
+      <w:r>
+        <w:drawing>
+          <wp:inline distT="0" distB="0" distL="0" distR="0" wp14:anchorId="5EC93F76" wp14:editId="23950830">
+            <wp:extent cx="4638675" cy="3286719"/>
+            <wp:effectExtent l="0" t="0" r="0" b="9525"/>
+            <wp:docPr id="603420782" name="Picture 1" descr="A computer screen with a message box&#10;&#10;AI-generated content may be incorrect."/>
+            <wp:cNvGraphicFramePr>
+              <a:graphicFrameLocks xmlns:a="http://schemas.openxmlformats.org/drawingml/2006/main" noChangeAspect="1"/>
+            </wp:cNvGraphicFramePr>
+            <a:graphic xmlns:a="http://schemas.openxmlformats.org/drawingml/2006/main">
+              <a:graphicData uri="http://schemas.openxmlformats.org/drawingml/2006/picture">
+                <pic:pic xmlns:pic="http://schemas.openxmlformats.org/drawingml/2006/picture">
+                  <pic:nvPicPr>
+                    <pic:cNvPr id="603420782" name="Picture 1" descr="A computer screen with a message box&#10;&#10;AI-generated content may be incorrect."/>
+                    <pic:cNvPicPr/>
+                  </pic:nvPicPr>
+                  <pic:blipFill>
+                    <a:blip r:embed="rId14"/>
+                    <a:stretch>
+                      <a:fillRect/>
+                    </a:stretch>
+                  </pic:blipFill>
+                  <pic:spPr>
+                    <a:xfrm>
+                      <a:off x="0" y="0"/>
+                      <a:ext cx="4639837" cy="3287542"/>
+                    </a:xfrm>
+                    <a:prstGeom prst="rect">
+                      <a:avLst/>
+                    </a:prstGeom>
+                  </pic:spPr>
+                </pic:pic>
+              </a:graphicData>
+            </a:graphic>
+          </wp:inline>
+        </w:drawing>
+      </w:r>
+    </w:p>
+    <w:p>
+      <w:r>
+        <w:lastRenderedPageBreak/>
+        <w:t>File sharing</w:t>
+      </w:r>
+      <w:r>
+        <w:t>&gt;</w:t>
+      </w:r>
+    </w:p>
+    <w:p>
+      <w:r>
+        <w:t xml:space="preserve"> Method 1: Mapping</w:t>
+      </w:r>
+    </w:p>
+    <w:p>
+      <w:r>
+        <w:t>Create a folder to shared  by going to c driver</w:t>
+      </w:r>
+      <w:r>
+        <w:t xml:space="preserve"> on the DC server</w:t>
+      </w:r>
+      <w:r>
+        <w:t xml:space="preserve"> then create new folder.</w:t>
+      </w:r>
+    </w:p>
+    <w:p>
+      <w:r>
+        <w:t>After that click on properties and select share tab and put the access rights to the write group like the photo:</w:t>
+      </w:r>
+    </w:p>
+    <w:p>
+      <w:r>
+        <w:drawing>
+          <wp:inline distT="0" distB="0" distL="0" distR="0" wp14:anchorId="0CC94092" wp14:editId="1B3D2966">
+            <wp:extent cx="5943600" cy="4687570"/>
+            <wp:effectExtent l="0" t="0" r="0" b="0"/>
+            <wp:docPr id="957209306" name="Picture 1" descr="A screenshot of a computer&#10;&#10;AI-generated content may be incorrect."/>
+            <wp:cNvGraphicFramePr>
+              <a:graphicFrameLocks xmlns:a="http://schemas.openxmlformats.org/drawingml/2006/main" noChangeAspect="1"/>
+            </wp:cNvGraphicFramePr>
+            <a:graphic xmlns:a="http://schemas.openxmlformats.org/drawingml/2006/main">
+              <a:graphicData uri="http://schemas.openxmlformats.org/drawingml/2006/picture">
+                <pic:pic xmlns:pic="http://schemas.openxmlformats.org/drawingml/2006/picture">
+                  <pic:nvPicPr>
+                    <pic:cNvPr id="957209306" name="Picture 1" descr="A screenshot of a computer&#10;&#10;AI-generated content may be incorrect."/>
+                    <pic:cNvPicPr/>
+                  </pic:nvPicPr>
+                  <pic:blipFill>
+                    <a:blip r:embed="rId15"/>
+                    <a:stretch>
+                      <a:fillRect/>
+                    </a:stretch>
+                  </pic:blipFill>
+                  <pic:spPr>
+                    <a:xfrm>
+                      <a:off x="0" y="0"/>
+                      <a:ext cx="5943600" cy="4687570"/>
+                    </a:xfrm>
+                    <a:prstGeom prst="rect">
+                      <a:avLst/>
+                    </a:prstGeom>
+                  </pic:spPr>
+                </pic:pic>
+              </a:graphicData>
+            </a:graphic>
+          </wp:inline>
+        </w:drawing>
+      </w:r>
+    </w:p>
+    <w:p>
+      <w:r>
+        <w:t xml:space="preserve"> go to file explorer</w:t>
+      </w:r>
+      <w:r>
+        <w:t xml:space="preserve"> on the Client PC</w:t>
+      </w:r>
+      <w:r>
+        <w:t xml:space="preserve"> , then this PC , right click and select map network Driver.</w:t>
+      </w:r>
+    </w:p>
+    <w:p>
+      <w:r>
+        <w:t xml:space="preserve">Then type the name of the server host and the shared file name like this </w:t>
+      </w:r>
+      <w:hyperlink r:id="rId16" w:history="1">
+        <w:r>
+          <w:rPr>
+            <w:rStyle w:val="Hyperlink"/>
+          </w:rPr>
+          <w:t>\\hostname\Shared</w:t>
+        </w:r>
+      </w:hyperlink>
+      <w:r>
+        <w:t xml:space="preserve"> file name like in the photo</w:t>
+      </w:r>
+    </w:p>
+    <w:p>
+      <w:r>
+        <w:lastRenderedPageBreak/>
+        <w:drawing>
+          <wp:inline distT="0" distB="0" distL="0" distR="0" wp14:anchorId="103D4FFE" wp14:editId="0C63A1B0">
+            <wp:extent cx="5943600" cy="4126230"/>
+            <wp:effectExtent l="0" t="0" r="0" b="7620"/>
+            <wp:docPr id="1145642353" name="Picture 1" descr="A screenshot of a computer&#10;&#10;AI-generated content may be incorrect."/>
+            <wp:cNvGraphicFramePr>
+              <a:graphicFrameLocks xmlns:a="http://schemas.openxmlformats.org/drawingml/2006/main" noChangeAspect="1"/>
+            </wp:cNvGraphicFramePr>
+            <a:graphic xmlns:a="http://schemas.openxmlformats.org/drawingml/2006/main">
+              <a:graphicData uri="http://schemas.openxmlformats.org/drawingml/2006/picture">
+                <pic:pic xmlns:pic="http://schemas.openxmlformats.org/drawingml/2006/picture">
+                  <pic:nvPicPr>
+                    <pic:cNvPr id="1145642353" name="Picture 1" descr="A screenshot of a computer&#10;&#10;AI-generated content may be incorrect."/>
+                    <pic:cNvPicPr/>
+                  </pic:nvPicPr>
+                  <pic:blipFill>
+                    <a:blip r:embed="rId17"/>
+                    <a:stretch>
+                      <a:fillRect/>
+                    </a:stretch>
+                  </pic:blipFill>
+                  <pic:spPr>
+                    <a:xfrm>
+                      <a:off x="0" y="0"/>
+                      <a:ext cx="5943600" cy="4126230"/>
+                    </a:xfrm>
+                    <a:prstGeom prst="rect">
+                      <a:avLst/>
+                    </a:prstGeom>
+                  </pic:spPr>
+                </pic:pic>
+              </a:graphicData>
+            </a:graphic>
+          </wp:inline>
+        </w:drawing>
+      </w:r>
+    </w:p>
+    <w:p>
+      <w:r>
+        <w:t>Now you should be able to see the shared file in the file explorer</w:t>
       </w:r>
     </w:p>
     <w:sectPr>
@@ -654,8 +1001,124 @@
       </w:pPr>
     </w:lvl>
   </w:abstractNum>
+  <w:abstractNum w:abstractNumId="1" w15:restartNumberingAfterBreak="0">
+    <w:nsid w:val="6EED54AE"/>
+    <w:multiLevelType w:val="hybridMultilevel"/>
+    <w:tmpl w:val="C7080AF8"/>
+    <w:lvl w:ilvl="0" w:tplc="04090001">
+      <w:start w:val="1"/>
+      <w:numFmt w:val="bullet"/>
+      <w:lvlText w:val=""/>
+      <w:lvlJc w:val="left"/>
+      <w:pPr>
+        <w:ind w:left="720" w:hanging="360"/>
+      </w:pPr>
+      <w:rPr>
+        <w:rFonts w:ascii="Symbol" w:hAnsi="Symbol" w:hint="default"/>
+      </w:rPr>
+    </w:lvl>
+    <w:lvl w:ilvl="1" w:tplc="04090003" w:tentative="1">
+      <w:start w:val="1"/>
+      <w:numFmt w:val="bullet"/>
+      <w:lvlText w:val="o"/>
+      <w:lvlJc w:val="left"/>
+      <w:pPr>
+        <w:ind w:left="1440" w:hanging="360"/>
+      </w:pPr>
+      <w:rPr>
+        <w:rFonts w:ascii="Courier New" w:hAnsi="Courier New" w:cs="Courier New" w:hint="default"/>
+      </w:rPr>
+    </w:lvl>
+    <w:lvl w:ilvl="2" w:tplc="04090005" w:tentative="1">
+      <w:start w:val="1"/>
+      <w:numFmt w:val="bullet"/>
+      <w:lvlText w:val=""/>
+      <w:lvlJc w:val="left"/>
+      <w:pPr>
+        <w:ind w:left="2160" w:hanging="360"/>
+      </w:pPr>
+      <w:rPr>
+        <w:rFonts w:ascii="Wingdings" w:hAnsi="Wingdings" w:hint="default"/>
+      </w:rPr>
+    </w:lvl>
+    <w:lvl w:ilvl="3" w:tplc="04090001" w:tentative="1">
+      <w:start w:val="1"/>
+      <w:numFmt w:val="bullet"/>
+      <w:lvlText w:val=""/>
+      <w:lvlJc w:val="left"/>
+      <w:pPr>
+        <w:ind w:left="2880" w:hanging="360"/>
+      </w:pPr>
+      <w:rPr>
+        <w:rFonts w:ascii="Symbol" w:hAnsi="Symbol" w:hint="default"/>
+      </w:rPr>
+    </w:lvl>
+    <w:lvl w:ilvl="4" w:tplc="04090003" w:tentative="1">
+      <w:start w:val="1"/>
+      <w:numFmt w:val="bullet"/>
+      <w:lvlText w:val="o"/>
+      <w:lvlJc w:val="left"/>
+      <w:pPr>
+        <w:ind w:left="3600" w:hanging="360"/>
+      </w:pPr>
+      <w:rPr>
+        <w:rFonts w:ascii="Courier New" w:hAnsi="Courier New" w:cs="Courier New" w:hint="default"/>
+      </w:rPr>
+    </w:lvl>
+    <w:lvl w:ilvl="5" w:tplc="04090005" w:tentative="1">
+      <w:start w:val="1"/>
+      <w:numFmt w:val="bullet"/>
+      <w:lvlText w:val=""/>
+      <w:lvlJc w:val="left"/>
+      <w:pPr>
+        <w:ind w:left="4320" w:hanging="360"/>
+      </w:pPr>
+      <w:rPr>
+        <w:rFonts w:ascii="Wingdings" w:hAnsi="Wingdings" w:hint="default"/>
+      </w:rPr>
+    </w:lvl>
+    <w:lvl w:ilvl="6" w:tplc="04090001" w:tentative="1">
+      <w:start w:val="1"/>
+      <w:numFmt w:val="bullet"/>
+      <w:lvlText w:val=""/>
+      <w:lvlJc w:val="left"/>
+      <w:pPr>
+        <w:ind w:left="5040" w:hanging="360"/>
+      </w:pPr>
+      <w:rPr>
+        <w:rFonts w:ascii="Symbol" w:hAnsi="Symbol" w:hint="default"/>
+      </w:rPr>
+    </w:lvl>
+    <w:lvl w:ilvl="7" w:tplc="04090003" w:tentative="1">
+      <w:start w:val="1"/>
+      <w:numFmt w:val="bullet"/>
+      <w:lvlText w:val="o"/>
+      <w:lvlJc w:val="left"/>
+      <w:pPr>
+        <w:ind w:left="5760" w:hanging="360"/>
+      </w:pPr>
+      <w:rPr>
+        <w:rFonts w:ascii="Courier New" w:hAnsi="Courier New" w:cs="Courier New" w:hint="default"/>
+      </w:rPr>
+    </w:lvl>
+    <w:lvl w:ilvl="8" w:tplc="04090005" w:tentative="1">
+      <w:start w:val="1"/>
+      <w:numFmt w:val="bullet"/>
+      <w:lvlText w:val=""/>
+      <w:lvlJc w:val="left"/>
+      <w:pPr>
+        <w:ind w:left="6480" w:hanging="360"/>
+      </w:pPr>
+      <w:rPr>
+        <w:rFonts w:ascii="Wingdings" w:hAnsi="Wingdings" w:hint="default"/>
+      </w:rPr>
+    </w:lvl>
+  </w:abstractNum>
   <w:num w:numId="1" w16cid:durableId="1713844965">
     <w:abstractNumId w:val="0"/>
+  </w:num>
+  <w:num w:numId="2" w16cid:durableId="1787692271">
+    <w:abstractNumId w:val="1"/>
   </w:num>
 </w:numbering>
 </file>
@@ -1060,7 +1523,7 @@
   <w:style w:type="paragraph" w:default="1" w:styleId="Normal">
     <w:name w:val="Normal"/>
     <w:qFormat/>
-    <w:rsid w:val="001B0290"/>
+    <w:rsid w:val="004F1CE7"/>
   </w:style>
   <w:style w:type="paragraph" w:styleId="Heading1">
     <w:name w:val="heading 1"/>

</xml_diff>

<commit_message>
install and add quotas and file screening to manage the resources of the shared folders user FSRM
</commit_message>
<xml_diff>
--- a/New Microsoft Word Document.docx
+++ b/New Microsoft Word Document.docx
@@ -36,7 +36,21 @@
           <w:rPr>
             <w:rStyle w:val="Hyperlink"/>
           </w:rPr>
-          <w:t>Installing Active Directory on Windows Server on Virtual Machine (Home Lab) (Ep. 1)</w:t>
+          <w:t xml:space="preserve">Installing Active Directory on Windows </w:t>
+        </w:r>
+        <w:proofErr w:type="gramStart"/>
+        <w:r>
+          <w:rPr>
+            <w:rStyle w:val="Hyperlink"/>
+          </w:rPr>
+          <w:t>Server on</w:t>
+        </w:r>
+        <w:proofErr w:type="gramEnd"/>
+        <w:r>
+          <w:rPr>
+            <w:rStyle w:val="Hyperlink"/>
+          </w:rPr>
+          <w:t xml:space="preserve"> Virtual Machine (Home Lab) (Ep. 1)</w:t>
         </w:r>
       </w:hyperlink>
     </w:p>
@@ -55,8 +69,13 @@
     </w:p>
     <w:p>
       <w:r>
-        <w:t>COMPUTER CONFIGURATIONS vs User Conficurations</w:t>
-      </w:r>
+        <w:t xml:space="preserve">COMPUTER CONFIGURATIONS vs User </w:t>
+      </w:r>
+      <w:proofErr w:type="spellStart"/>
+      <w:r>
+        <w:t>Conficurations</w:t>
+      </w:r>
+      <w:proofErr w:type="spellEnd"/>
     </w:p>
     <w:p>
       <w:hyperlink r:id="rId6" w:history="1">
@@ -77,9 +96,11 @@
       </w:r>
     </w:p>
     <w:p>
+      <w:proofErr w:type="spellStart"/>
       <w:r>
         <w:t>nslook</w:t>
       </w:r>
+      <w:proofErr w:type="spellEnd"/>
     </w:p>
     <w:p>
       <w:hyperlink r:id="rId7" w:history="1">
@@ -87,7 +108,21 @@
           <w:rPr>
             <w:rStyle w:val="Hyperlink"/>
           </w:rPr>
-          <w:t>Installing Active Directory on Windows Server on Virtual Machine (Home Lab) (Ep. 1)</w:t>
+          <w:t xml:space="preserve">Installing Active Directory on Windows </w:t>
+        </w:r>
+        <w:proofErr w:type="gramStart"/>
+        <w:r>
+          <w:rPr>
+            <w:rStyle w:val="Hyperlink"/>
+          </w:rPr>
+          <w:t>Server on</w:t>
+        </w:r>
+        <w:proofErr w:type="gramEnd"/>
+        <w:r>
+          <w:rPr>
+            <w:rStyle w:val="Hyperlink"/>
+          </w:rPr>
+          <w:t xml:space="preserve"> Virtual Machine (Home Lab) (Ep. 1)</w:t>
         </w:r>
       </w:hyperlink>
     </w:p>
@@ -104,8 +139,13 @@
         <w:t xml:space="preserve">In </w:t>
       </w:r>
       <w:r>
-        <w:t>group policy managment</w:t>
-      </w:r>
+        <w:t xml:space="preserve">group policy </w:t>
+      </w:r>
+      <w:proofErr w:type="spellStart"/>
+      <w:r>
+        <w:t>managment</w:t>
+      </w:r>
+      <w:proofErr w:type="spellEnd"/>
       <w:r>
         <w:t>,</w:t>
       </w:r>
@@ -181,7 +221,15 @@
     </w:p>
     <w:p>
       <w:r>
-        <w:t xml:space="preserve">In group policy managment, create under the Domain a new GPO, then edit it </w:t>
+        <w:t xml:space="preserve">In group policy </w:t>
+      </w:r>
+      <w:proofErr w:type="spellStart"/>
+      <w:r>
+        <w:t>managment</w:t>
+      </w:r>
+      <w:proofErr w:type="spellEnd"/>
+      <w:r>
+        <w:t xml:space="preserve">, create under the Domain a new GPO, then edit it </w:t>
       </w:r>
     </w:p>
     <w:p>
@@ -243,7 +291,15 @@
     </w:p>
     <w:p>
       <w:r>
-        <w:t xml:space="preserve">In group policy managment, create under the Domain a new GPO, then edit it </w:t>
+        <w:t xml:space="preserve">In group policy </w:t>
+      </w:r>
+      <w:proofErr w:type="spellStart"/>
+      <w:r>
+        <w:t>managment</w:t>
+      </w:r>
+      <w:proofErr w:type="spellEnd"/>
+      <w:r>
+        <w:t xml:space="preserve">, create under the Domain a new GPO, then edit it </w:t>
       </w:r>
     </w:p>
     <w:p>
@@ -337,7 +393,15 @@
     </w:p>
     <w:p>
       <w:r>
-        <w:t xml:space="preserve">In group policy managment, create under the Domain a new GPO, then edit it </w:t>
+        <w:t xml:space="preserve">In group policy </w:t>
+      </w:r>
+      <w:proofErr w:type="spellStart"/>
+      <w:r>
+        <w:t>managment</w:t>
+      </w:r>
+      <w:proofErr w:type="spellEnd"/>
+      <w:r>
+        <w:t xml:space="preserve">, create under the Domain a new GPO, then edit it </w:t>
       </w:r>
     </w:p>
     <w:p>
@@ -363,11 +427,16 @@
         <w:t xml:space="preserve"> </w:t>
       </w:r>
       <w:r>
-        <w:t xml:space="preserve">number of tries do you want </w:t>
+        <w:t xml:space="preserve">number of tries do you </w:t>
+      </w:r>
+      <w:proofErr w:type="gramStart"/>
+      <w:r>
+        <w:t xml:space="preserve">want </w:t>
       </w:r>
       <w:r>
         <w:t>.</w:t>
       </w:r>
+      <w:proofErr w:type="gramEnd"/>
     </w:p>
     <w:p/>
     <w:p>
@@ -530,7 +599,15 @@
     </w:p>
     <w:p>
       <w:r>
-        <w:t>On the client machine in the Ethernet config, keep the DHCP enabled, but in the DNS put it the same Static IP address of the server machine.</w:t>
+        <w:t xml:space="preserve">On the client machine in the Ethernet config, keep the DHCP enabled, but in the DNS </w:t>
+      </w:r>
+      <w:proofErr w:type="gramStart"/>
+      <w:r>
+        <w:t>put it</w:t>
+      </w:r>
+      <w:proofErr w:type="gramEnd"/>
+      <w:r>
+        <w:t xml:space="preserve"> the same Static IP address of the server machine.</w:t>
       </w:r>
     </w:p>
     <w:p>
@@ -540,14 +617,56 @@
     </w:p>
     <w:p/>
     <w:p>
-      <w:r>
-        <w:t>Ncpa.cpl in cmd</w:t>
-      </w:r>
+      <w:proofErr w:type="spellStart"/>
+      <w:r>
+        <w:t>Ncpa.cpl</w:t>
+      </w:r>
+      <w:proofErr w:type="spellEnd"/>
+      <w:r>
+        <w:t xml:space="preserve"> in </w:t>
+      </w:r>
+      <w:proofErr w:type="spellStart"/>
+      <w:r>
+        <w:t>cmd</w:t>
+      </w:r>
+      <w:proofErr w:type="spellEnd"/>
     </w:p>
     <w:p/>
     <w:p>
       <w:r>
-        <w:t xml:space="preserve">Put the dns on the client the same static ip as the DC ip adresse </w:t>
+        <w:t xml:space="preserve">Put the </w:t>
+      </w:r>
+      <w:proofErr w:type="spellStart"/>
+      <w:r>
+        <w:t>dns</w:t>
+      </w:r>
+      <w:proofErr w:type="spellEnd"/>
+      <w:r>
+        <w:t xml:space="preserve"> on the client the same static </w:t>
+      </w:r>
+      <w:proofErr w:type="spellStart"/>
+      <w:r>
+        <w:t>ip</w:t>
+      </w:r>
+      <w:proofErr w:type="spellEnd"/>
+      <w:r>
+        <w:t xml:space="preserve"> as the DC </w:t>
+      </w:r>
+      <w:proofErr w:type="spellStart"/>
+      <w:r>
+        <w:t>ip</w:t>
+      </w:r>
+      <w:proofErr w:type="spellEnd"/>
+      <w:r>
+        <w:t xml:space="preserve"> </w:t>
+      </w:r>
+      <w:proofErr w:type="spellStart"/>
+      <w:r>
+        <w:t>adresse</w:t>
+      </w:r>
+      <w:proofErr w:type="spellEnd"/>
+      <w:r>
+        <w:t xml:space="preserve"> </w:t>
       </w:r>
     </w:p>
     <w:p>
@@ -561,7 +680,33 @@
         <w:t>manager,</w:t>
       </w:r>
       <w:r>
-        <w:t xml:space="preserve"> open the domain.local and add new a or aaaa record , leave the name empty and the ip address the same as the dc static server.</w:t>
+        <w:t xml:space="preserve"> open the </w:t>
+      </w:r>
+      <w:proofErr w:type="spellStart"/>
+      <w:proofErr w:type="gramStart"/>
+      <w:r>
+        <w:t>domain.local</w:t>
+      </w:r>
+      <w:proofErr w:type="spellEnd"/>
+      <w:proofErr w:type="gramEnd"/>
+      <w:r>
+        <w:t xml:space="preserve"> and add new a or </w:t>
+      </w:r>
+      <w:proofErr w:type="spellStart"/>
+      <w:r>
+        <w:t>aaaa</w:t>
+      </w:r>
+      <w:proofErr w:type="spellEnd"/>
+      <w:r>
+        <w:t xml:space="preserve"> record , leave the name empty and the </w:t>
+      </w:r>
+      <w:proofErr w:type="spellStart"/>
+      <w:r>
+        <w:t>ip</w:t>
+      </w:r>
+      <w:proofErr w:type="spellEnd"/>
+      <w:r>
+        <w:t xml:space="preserve"> address the same as the dc static server.</w:t>
       </w:r>
     </w:p>
     <w:p>
@@ -574,10 +719,18 @@
     </w:p>
     <w:p>
       <w:r>
-        <w:t>Also,</w:t>
-      </w:r>
-      <w:r>
-        <w:t xml:space="preserve"> on the server put the </w:t>
+        <w:t>Also</w:t>
+      </w:r>
+      <w:proofErr w:type="gramStart"/>
+      <w:r>
+        <w:t>,</w:t>
+      </w:r>
+      <w:r>
+        <w:t xml:space="preserve"> on the server</w:t>
+      </w:r>
+      <w:proofErr w:type="gramEnd"/>
+      <w:r>
+        <w:t xml:space="preserve"> put the </w:t>
       </w:r>
       <w:r>
         <w:t>DNS</w:t>
@@ -602,7 +755,15 @@
         <w:t>Example:</w:t>
       </w:r>
       <w:r>
-        <w:t xml:space="preserve"> create a Policy to prevent access to control panel.</w:t>
+        <w:t xml:space="preserve"> create a Policy to prevent access to control </w:t>
+      </w:r>
+      <w:proofErr w:type="gramStart"/>
+      <w:r>
+        <w:t>panel</w:t>
+      </w:r>
+      <w:proofErr w:type="gramEnd"/>
+      <w:r>
+        <w:t>.</w:t>
       </w:r>
     </w:p>
     <w:p>
@@ -623,10 +784,18 @@
         <w:t xml:space="preserve"> -&gt; </w:t>
       </w:r>
       <w:r>
-        <w:t xml:space="preserve">control panel </w:t>
-      </w:r>
-      <w:r>
-        <w:t xml:space="preserve"> -&gt; </w:t>
+        <w:t xml:space="preserve">control </w:t>
+      </w:r>
+      <w:proofErr w:type="gramStart"/>
+      <w:r>
+        <w:t xml:space="preserve">panel </w:t>
+      </w:r>
+      <w:r>
+        <w:t xml:space="preserve"> -</w:t>
+      </w:r>
+      <w:proofErr w:type="gramEnd"/>
+      <w:r>
+        <w:t xml:space="preserve">&gt; </w:t>
       </w:r>
       <w:r>
         <w:t>Admin Templates</w:t>
@@ -655,6 +824,9 @@
         <w:pStyle w:val="ListParagraph"/>
       </w:pPr>
       <w:r>
+        <w:rPr>
+          <w:noProof/>
+        </w:rPr>
         <w:drawing>
           <wp:inline distT="0" distB="0" distL="0" distR="0" wp14:anchorId="44C064E1" wp14:editId="4F721127">
             <wp:extent cx="4768664" cy="2724150"/>
@@ -702,7 +874,15 @@
         </w:numPr>
       </w:pPr>
       <w:r>
-        <w:t>Then on client PC open terminal and type gpupdate /force</w:t>
+        <w:t xml:space="preserve">Then on client PC open terminal and type </w:t>
+      </w:r>
+      <w:proofErr w:type="spellStart"/>
+      <w:r>
+        <w:t>gpupdate</w:t>
+      </w:r>
+      <w:proofErr w:type="spellEnd"/>
+      <w:r>
+        <w:t xml:space="preserve"> /force</w:t>
       </w:r>
     </w:p>
     <w:p>
@@ -714,7 +894,15 @@
         </w:numPr>
       </w:pPr>
       <w:r>
-        <w:t>Now client machine can’t have access to control panel</w:t>
+        <w:t xml:space="preserve">Now client </w:t>
+      </w:r>
+      <w:proofErr w:type="gramStart"/>
+      <w:r>
+        <w:t>machine</w:t>
+      </w:r>
+      <w:proofErr w:type="gramEnd"/>
+      <w:r>
+        <w:t xml:space="preserve"> can’t have access to control panel</w:t>
       </w:r>
     </w:p>
     <w:p>
@@ -722,6 +910,9 @@
         <w:pStyle w:val="ListParagraph"/>
       </w:pPr>
       <w:r>
+        <w:rPr>
+          <w:noProof/>
+        </w:rPr>
         <w:drawing>
           <wp:inline distT="0" distB="0" distL="0" distR="0" wp14:anchorId="5EC93F76" wp14:editId="23950830">
             <wp:extent cx="4638675" cy="3286719"/>
@@ -760,13 +951,49 @@
       </w:r>
     </w:p>
     <w:p>
-      <w:r>
+      <w:pPr>
+        <w:rPr>
+          <w:b/>
+          <w:bCs/>
+        </w:rPr>
+      </w:pPr>
+      <w:r>
+        <w:rPr>
+          <w:b/>
+          <w:bCs/>
+        </w:rPr>
         <w:lastRenderedPageBreak/>
         <w:t>File sharing</w:t>
       </w:r>
       <w:r>
+        <w:rPr>
+          <w:b/>
+          <w:bCs/>
+        </w:rPr>
         <w:t>&gt;</w:t>
       </w:r>
+      <w:r>
+        <w:rPr>
+          <w:b/>
+          <w:bCs/>
+        </w:rPr>
+        <w:t xml:space="preserve"> </w:t>
+      </w:r>
+    </w:p>
+    <w:p>
+      <w:pPr>
+        <w:rPr>
+          <w:b/>
+          <w:bCs/>
+        </w:rPr>
+      </w:pPr>
+      <w:r>
+        <w:rPr>
+          <w:b/>
+          <w:bCs/>
+        </w:rPr>
+        <w:t>Sharing methods:</w:t>
+      </w:r>
     </w:p>
     <w:p>
       <w:r>
@@ -775,7 +1002,13 @@
     </w:p>
     <w:p>
       <w:r>
-        <w:t>Create a folder to shared  by going to c driver</w:t>
+        <w:t xml:space="preserve">Create a folder to </w:t>
+      </w:r>
+      <w:r>
+        <w:t>share by</w:t>
+      </w:r>
+      <w:r>
+        <w:t xml:space="preserve"> going to c driver</w:t>
       </w:r>
       <w:r>
         <w:t xml:space="preserve"> on the DC server</w:t>
@@ -791,6 +1024,9 @@
     </w:p>
     <w:p>
       <w:r>
+        <w:rPr>
+          <w:noProof/>
+        </w:rPr>
         <w:drawing>
           <wp:inline distT="0" distB="0" distL="0" distR="0" wp14:anchorId="0CC94092" wp14:editId="1B3D2966">
             <wp:extent cx="5943600" cy="4687570"/>
@@ -833,10 +1069,18 @@
         <w:t xml:space="preserve"> go to file explorer</w:t>
       </w:r>
       <w:r>
-        <w:t xml:space="preserve"> on the Client PC</w:t>
-      </w:r>
-      <w:r>
-        <w:t xml:space="preserve"> , then this PC , right click and select map network Driver.</w:t>
+        <w:t xml:space="preserve"> on the Client </w:t>
+      </w:r>
+      <w:proofErr w:type="gramStart"/>
+      <w:r>
+        <w:t>PC</w:t>
+      </w:r>
+      <w:r>
+        <w:t xml:space="preserve"> ,</w:t>
+      </w:r>
+      <w:proofErr w:type="gramEnd"/>
+      <w:r>
+        <w:t xml:space="preserve"> then this PC , right click and select map network Driver.</w:t>
       </w:r>
     </w:p>
     <w:p>
@@ -857,11 +1101,14 @@
     </w:p>
     <w:p>
       <w:r>
+        <w:rPr>
+          <w:noProof/>
+        </w:rPr>
         <w:lastRenderedPageBreak/>
         <w:drawing>
-          <wp:inline distT="0" distB="0" distL="0" distR="0" wp14:anchorId="103D4FFE" wp14:editId="0C63A1B0">
-            <wp:extent cx="5943600" cy="4126230"/>
-            <wp:effectExtent l="0" t="0" r="0" b="7620"/>
+          <wp:inline distT="0" distB="0" distL="0" distR="0" wp14:anchorId="103D4FFE" wp14:editId="0344E79B">
+            <wp:extent cx="4295775" cy="2982259"/>
+            <wp:effectExtent l="0" t="0" r="0" b="8890"/>
             <wp:docPr id="1145642353" name="Picture 1" descr="A screenshot of a computer&#10;&#10;AI-generated content may be incorrect."/>
             <wp:cNvGraphicFramePr>
               <a:graphicFrameLocks xmlns:a="http://schemas.openxmlformats.org/drawingml/2006/main" noChangeAspect="1"/>
@@ -882,7 +1129,7 @@
                   <pic:spPr>
                     <a:xfrm>
                       <a:off x="0" y="0"/>
-                      <a:ext cx="5943600" cy="4126230"/>
+                      <a:ext cx="4298031" cy="2983825"/>
                     </a:xfrm>
                     <a:prstGeom prst="rect">
                       <a:avLst/>
@@ -898,6 +1145,436 @@
     <w:p>
       <w:r>
         <w:t>Now you should be able to see the shared file in the file explorer</w:t>
+      </w:r>
+    </w:p>
+    <w:p>
+      <w:r>
+        <w:drawing>
+          <wp:inline distT="0" distB="0" distL="0" distR="0" wp14:anchorId="0ED3B978" wp14:editId="558301ED">
+            <wp:extent cx="4865459" cy="3352800"/>
+            <wp:effectExtent l="0" t="0" r="0" b="0"/>
+            <wp:docPr id="630327400" name="Picture 1" descr="A screenshot of a computer&#10;&#10;AI-generated content may be incorrect."/>
+            <wp:cNvGraphicFramePr>
+              <a:graphicFrameLocks xmlns:a="http://schemas.openxmlformats.org/drawingml/2006/main" noChangeAspect="1"/>
+            </wp:cNvGraphicFramePr>
+            <a:graphic xmlns:a="http://schemas.openxmlformats.org/drawingml/2006/main">
+              <a:graphicData uri="http://schemas.openxmlformats.org/drawingml/2006/picture">
+                <pic:pic xmlns:pic="http://schemas.openxmlformats.org/drawingml/2006/picture">
+                  <pic:nvPicPr>
+                    <pic:cNvPr id="630327400" name="Picture 1" descr="A screenshot of a computer&#10;&#10;AI-generated content may be incorrect."/>
+                    <pic:cNvPicPr/>
+                  </pic:nvPicPr>
+                  <pic:blipFill>
+                    <a:blip r:embed="rId18"/>
+                    <a:stretch>
+                      <a:fillRect/>
+                    </a:stretch>
+                  </pic:blipFill>
+                  <pic:spPr>
+                    <a:xfrm>
+                      <a:off x="0" y="0"/>
+                      <a:ext cx="4869436" cy="3355541"/>
+                    </a:xfrm>
+                    <a:prstGeom prst="rect">
+                      <a:avLst/>
+                    </a:prstGeom>
+                  </pic:spPr>
+                </pic:pic>
+              </a:graphicData>
+            </a:graphic>
+          </wp:inline>
+        </w:drawing>
+      </w:r>
+    </w:p>
+    <w:p>
+      <w:r>
+        <w:t>PS: this method is only temporary, and the shared driver will not be visible after restarting.</w:t>
+      </w:r>
+    </w:p>
+    <w:p>
+      <w:r>
+        <w:t>This method is good for temporary file sharing.</w:t>
+      </w:r>
+    </w:p>
+    <w:p>
+      <w:proofErr w:type="gramStart"/>
+      <w:r>
+        <w:t>In order to</w:t>
+      </w:r>
+      <w:proofErr w:type="gramEnd"/>
+      <w:r>
+        <w:t xml:space="preserve"> make the shared file appear all the time then follow Method 2.</w:t>
+      </w:r>
+    </w:p>
+    <w:p>
+      <w:r>
+        <w:t xml:space="preserve">Method </w:t>
+      </w:r>
+      <w:r>
+        <w:t>2: Network</w:t>
+      </w:r>
+    </w:p>
+    <w:p>
+      <w:r>
+        <w:lastRenderedPageBreak/>
+        <w:t xml:space="preserve">Configure GPO automatically map network drives for users </w:t>
+      </w:r>
+    </w:p>
+    <w:p>
+      <w:r>
+        <w:drawing>
+          <wp:inline distT="0" distB="0" distL="0" distR="0" wp14:anchorId="6DF206C0" wp14:editId="30972B1F">
+            <wp:extent cx="4980804" cy="3981450"/>
+            <wp:effectExtent l="0" t="0" r="0" b="0"/>
+            <wp:docPr id="778144339" name="Picture 1" descr="A computer screen with a computer screen&#10;&#10;AI-generated content may be incorrect."/>
+            <wp:cNvGraphicFramePr>
+              <a:graphicFrameLocks xmlns:a="http://schemas.openxmlformats.org/drawingml/2006/main" noChangeAspect="1"/>
+            </wp:cNvGraphicFramePr>
+            <a:graphic xmlns:a="http://schemas.openxmlformats.org/drawingml/2006/main">
+              <a:graphicData uri="http://schemas.openxmlformats.org/drawingml/2006/picture">
+                <pic:pic xmlns:pic="http://schemas.openxmlformats.org/drawingml/2006/picture">
+                  <pic:nvPicPr>
+                    <pic:cNvPr id="778144339" name="Picture 1" descr="A computer screen with a computer screen&#10;&#10;AI-generated content may be incorrect."/>
+                    <pic:cNvPicPr/>
+                  </pic:nvPicPr>
+                  <pic:blipFill>
+                    <a:blip r:embed="rId19"/>
+                    <a:stretch>
+                      <a:fillRect/>
+                    </a:stretch>
+                  </pic:blipFill>
+                  <pic:spPr>
+                    <a:xfrm>
+                      <a:off x="0" y="0"/>
+                      <a:ext cx="4982986" cy="3983194"/>
+                    </a:xfrm>
+                    <a:prstGeom prst="rect">
+                      <a:avLst/>
+                    </a:prstGeom>
+                  </pic:spPr>
+                </pic:pic>
+              </a:graphicData>
+            </a:graphic>
+          </wp:inline>
+        </w:drawing>
+      </w:r>
+    </w:p>
+    <w:p>
+      <w:r>
+        <w:t xml:space="preserve">Then on </w:t>
+      </w:r>
+      <w:proofErr w:type="gramStart"/>
+      <w:r>
+        <w:t>client ,</w:t>
+      </w:r>
+      <w:proofErr w:type="gramEnd"/>
+      <w:r>
+        <w:t xml:space="preserve"> open terminal then </w:t>
+      </w:r>
+      <w:proofErr w:type="spellStart"/>
+      <w:r>
+        <w:t>gpupdate</w:t>
+      </w:r>
+      <w:proofErr w:type="spellEnd"/>
+      <w:r>
+        <w:t xml:space="preserve"> \force , then reboot and you should see the shared driver in the file explorer</w:t>
+      </w:r>
+    </w:p>
+    <w:p>
+      <w:r>
+        <w:drawing>
+          <wp:inline distT="0" distB="0" distL="0" distR="0" wp14:anchorId="53ACEE69" wp14:editId="095F2685">
+            <wp:extent cx="3978066" cy="3009900"/>
+            <wp:effectExtent l="0" t="0" r="3810" b="0"/>
+            <wp:docPr id="511982210" name="Picture 1" descr="A screenshot of a computer&#10;&#10;AI-generated content may be incorrect."/>
+            <wp:cNvGraphicFramePr>
+              <a:graphicFrameLocks xmlns:a="http://schemas.openxmlformats.org/drawingml/2006/main" noChangeAspect="1"/>
+            </wp:cNvGraphicFramePr>
+            <a:graphic xmlns:a="http://schemas.openxmlformats.org/drawingml/2006/main">
+              <a:graphicData uri="http://schemas.openxmlformats.org/drawingml/2006/picture">
+                <pic:pic xmlns:pic="http://schemas.openxmlformats.org/drawingml/2006/picture">
+                  <pic:nvPicPr>
+                    <pic:cNvPr id="511982210" name="Picture 1" descr="A screenshot of a computer&#10;&#10;AI-generated content may be incorrect."/>
+                    <pic:cNvPicPr/>
+                  </pic:nvPicPr>
+                  <pic:blipFill>
+                    <a:blip r:embed="rId20"/>
+                    <a:stretch>
+                      <a:fillRect/>
+                    </a:stretch>
+                  </pic:blipFill>
+                  <pic:spPr>
+                    <a:xfrm>
+                      <a:off x="0" y="0"/>
+                      <a:ext cx="3981860" cy="3012771"/>
+                    </a:xfrm>
+                    <a:prstGeom prst="rect">
+                      <a:avLst/>
+                    </a:prstGeom>
+                  </pic:spPr>
+                </pic:pic>
+              </a:graphicData>
+            </a:graphic>
+          </wp:inline>
+        </w:drawing>
+      </w:r>
+    </w:p>
+    <w:p>
+      <w:r>
+        <w:lastRenderedPageBreak/>
+        <w:t>File server resource manager</w:t>
+      </w:r>
+    </w:p>
+    <w:p>
+      <w:r>
+        <w:t xml:space="preserve">In server </w:t>
+      </w:r>
+      <w:proofErr w:type="gramStart"/>
+      <w:r>
+        <w:t>manager ,</w:t>
+      </w:r>
+      <w:proofErr w:type="gramEnd"/>
+      <w:r>
+        <w:t xml:space="preserve"> create </w:t>
+      </w:r>
+      <w:r>
+        <w:t xml:space="preserve">a new role or </w:t>
+      </w:r>
+      <w:proofErr w:type="spellStart"/>
+      <w:r>
+        <w:t>Freater</w:t>
+      </w:r>
+      <w:proofErr w:type="spellEnd"/>
+      <w:r>
+        <w:t xml:space="preserve"> and select File server resource manager.</w:t>
+      </w:r>
+    </w:p>
+    <w:p>
+      <w:r>
+        <w:drawing>
+          <wp:inline distT="0" distB="0" distL="0" distR="0" wp14:anchorId="0890AB32" wp14:editId="3D4DDF6F">
+            <wp:extent cx="5943600" cy="4455795"/>
+            <wp:effectExtent l="0" t="0" r="0" b="1905"/>
+            <wp:docPr id="342785417" name="Picture 1" descr="A screenshot of a computer&#10;&#10;AI-generated content may be incorrect."/>
+            <wp:cNvGraphicFramePr>
+              <a:graphicFrameLocks xmlns:a="http://schemas.openxmlformats.org/drawingml/2006/main" noChangeAspect="1"/>
+            </wp:cNvGraphicFramePr>
+            <a:graphic xmlns:a="http://schemas.openxmlformats.org/drawingml/2006/main">
+              <a:graphicData uri="http://schemas.openxmlformats.org/drawingml/2006/picture">
+                <pic:pic xmlns:pic="http://schemas.openxmlformats.org/drawingml/2006/picture">
+                  <pic:nvPicPr>
+                    <pic:cNvPr id="342785417" name="Picture 1" descr="A screenshot of a computer&#10;&#10;AI-generated content may be incorrect."/>
+                    <pic:cNvPicPr/>
+                  </pic:nvPicPr>
+                  <pic:blipFill>
+                    <a:blip r:embed="rId21"/>
+                    <a:stretch>
+                      <a:fillRect/>
+                    </a:stretch>
+                  </pic:blipFill>
+                  <pic:spPr>
+                    <a:xfrm>
+                      <a:off x="0" y="0"/>
+                      <a:ext cx="5943600" cy="4455795"/>
+                    </a:xfrm>
+                    <a:prstGeom prst="rect">
+                      <a:avLst/>
+                    </a:prstGeom>
+                  </pic:spPr>
+                </pic:pic>
+              </a:graphicData>
+            </a:graphic>
+          </wp:inline>
+        </w:drawing>
+      </w:r>
+    </w:p>
+    <w:p/>
+    <w:p>
+      <w:r>
+        <w:t xml:space="preserve">After installing the FSRM </w:t>
+      </w:r>
+    </w:p>
+    <w:p>
+      <w:r>
+        <w:t xml:space="preserve">Lunch the file server resource management and create a Quota Template to put limits on the shared file size then after that create a file screening template to prevent </w:t>
+      </w:r>
+      <w:r>
+        <w:t>images, executables and</w:t>
+      </w:r>
+      <w:r>
+        <w:t xml:space="preserve"> videos </w:t>
+      </w:r>
+      <w:proofErr w:type="gramStart"/>
+      <w:r>
+        <w:t>to be</w:t>
+      </w:r>
+      <w:proofErr w:type="gramEnd"/>
+      <w:r>
+        <w:t xml:space="preserve"> added to the shared folder.</w:t>
+      </w:r>
+    </w:p>
+    <w:p>
+      <w:pPr>
+        <w:rPr>
+          <w:b/>
+          <w:bCs/>
+        </w:rPr>
+      </w:pPr>
+      <w:r>
+        <w:rPr>
+          <w:b/>
+          <w:bCs/>
+        </w:rPr>
+        <w:t>Quota</w:t>
+      </w:r>
+      <w:r>
+        <w:rPr>
+          <w:b/>
+          <w:bCs/>
+        </w:rPr>
+        <w:t xml:space="preserve"> Management</w:t>
+      </w:r>
+      <w:r>
+        <w:rPr>
+          <w:b/>
+          <w:bCs/>
+        </w:rPr>
+        <w:t>:</w:t>
+      </w:r>
+    </w:p>
+    <w:p>
+      <w:r>
+        <w:lastRenderedPageBreak/>
+        <w:drawing>
+          <wp:inline distT="0" distB="0" distL="0" distR="0" wp14:anchorId="424F6F7E" wp14:editId="0868B4DC">
+            <wp:extent cx="5943600" cy="4270375"/>
+            <wp:effectExtent l="0" t="0" r="0" b="0"/>
+            <wp:docPr id="1893329470" name="Picture 1" descr="A screenshot of a computer&#10;&#10;AI-generated content may be incorrect."/>
+            <wp:cNvGraphicFramePr>
+              <a:graphicFrameLocks xmlns:a="http://schemas.openxmlformats.org/drawingml/2006/main" noChangeAspect="1"/>
+            </wp:cNvGraphicFramePr>
+            <a:graphic xmlns:a="http://schemas.openxmlformats.org/drawingml/2006/main">
+              <a:graphicData uri="http://schemas.openxmlformats.org/drawingml/2006/picture">
+                <pic:pic xmlns:pic="http://schemas.openxmlformats.org/drawingml/2006/picture">
+                  <pic:nvPicPr>
+                    <pic:cNvPr id="1893329470" name="Picture 1" descr="A screenshot of a computer&#10;&#10;AI-generated content may be incorrect."/>
+                    <pic:cNvPicPr/>
+                  </pic:nvPicPr>
+                  <pic:blipFill>
+                    <a:blip r:embed="rId22"/>
+                    <a:stretch>
+                      <a:fillRect/>
+                    </a:stretch>
+                  </pic:blipFill>
+                  <pic:spPr>
+                    <a:xfrm>
+                      <a:off x="0" y="0"/>
+                      <a:ext cx="5943600" cy="4270375"/>
+                    </a:xfrm>
+                    <a:prstGeom prst="rect">
+                      <a:avLst/>
+                    </a:prstGeom>
+                  </pic:spPr>
+                </pic:pic>
+              </a:graphicData>
+            </a:graphic>
+          </wp:inline>
+        </w:drawing>
+      </w:r>
+    </w:p>
+    <w:p/>
+    <w:p>
+      <w:r>
+        <w:t>File screening Management:</w:t>
+      </w:r>
+    </w:p>
+    <w:p>
+      <w:r>
+        <w:t xml:space="preserve">Create a file Screen then make the custom Properties that you want to block. </w:t>
+      </w:r>
+    </w:p>
+    <w:p>
+      <w:r>
+        <w:lastRenderedPageBreak/>
+        <w:drawing>
+          <wp:inline distT="0" distB="0" distL="0" distR="0" wp14:anchorId="1017D9C8" wp14:editId="7036849E">
+            <wp:extent cx="4703536" cy="3362325"/>
+            <wp:effectExtent l="0" t="0" r="1905" b="0"/>
+            <wp:docPr id="620523050" name="Picture 1" descr="A screenshot of a computer&#10;&#10;AI-generated content may be incorrect."/>
+            <wp:cNvGraphicFramePr>
+              <a:graphicFrameLocks xmlns:a="http://schemas.openxmlformats.org/drawingml/2006/main" noChangeAspect="1"/>
+            </wp:cNvGraphicFramePr>
+            <a:graphic xmlns:a="http://schemas.openxmlformats.org/drawingml/2006/main">
+              <a:graphicData uri="http://schemas.openxmlformats.org/drawingml/2006/picture">
+                <pic:pic xmlns:pic="http://schemas.openxmlformats.org/drawingml/2006/picture">
+                  <pic:nvPicPr>
+                    <pic:cNvPr id="620523050" name="Picture 1" descr="A screenshot of a computer&#10;&#10;AI-generated content may be incorrect."/>
+                    <pic:cNvPicPr/>
+                  </pic:nvPicPr>
+                  <pic:blipFill>
+                    <a:blip r:embed="rId23"/>
+                    <a:stretch>
+                      <a:fillRect/>
+                    </a:stretch>
+                  </pic:blipFill>
+                  <pic:spPr>
+                    <a:xfrm>
+                      <a:off x="0" y="0"/>
+                      <a:ext cx="4705673" cy="3363853"/>
+                    </a:xfrm>
+                    <a:prstGeom prst="rect">
+                      <a:avLst/>
+                    </a:prstGeom>
+                  </pic:spPr>
+                </pic:pic>
+              </a:graphicData>
+            </a:graphic>
+          </wp:inline>
+        </w:drawing>
+      </w:r>
+    </w:p>
+    <w:p>
+      <w:r>
+        <w:t>And now we cannot add images into the Shared folder</w:t>
+      </w:r>
+    </w:p>
+    <w:p>
+      <w:r>
+        <w:drawing>
+          <wp:inline distT="0" distB="0" distL="0" distR="0" wp14:anchorId="1729E6A0" wp14:editId="3C74E9E3">
+            <wp:extent cx="4953000" cy="3485621"/>
+            <wp:effectExtent l="0" t="0" r="0" b="635"/>
+            <wp:docPr id="1072570793" name="Picture 1" descr="A computer screen shot of a computer&#10;&#10;AI-generated content may be incorrect."/>
+            <wp:cNvGraphicFramePr>
+              <a:graphicFrameLocks xmlns:a="http://schemas.openxmlformats.org/drawingml/2006/main" noChangeAspect="1"/>
+            </wp:cNvGraphicFramePr>
+            <a:graphic xmlns:a="http://schemas.openxmlformats.org/drawingml/2006/main">
+              <a:graphicData uri="http://schemas.openxmlformats.org/drawingml/2006/picture">
+                <pic:pic xmlns:pic="http://schemas.openxmlformats.org/drawingml/2006/picture">
+                  <pic:nvPicPr>
+                    <pic:cNvPr id="1072570793" name="Picture 1" descr="A computer screen shot of a computer&#10;&#10;AI-generated content may be incorrect."/>
+                    <pic:cNvPicPr/>
+                  </pic:nvPicPr>
+                  <pic:blipFill>
+                    <a:blip r:embed="rId24"/>
+                    <a:stretch>
+                      <a:fillRect/>
+                    </a:stretch>
+                  </pic:blipFill>
+                  <pic:spPr>
+                    <a:xfrm>
+                      <a:off x="0" y="0"/>
+                      <a:ext cx="4965840" cy="3494657"/>
+                    </a:xfrm>
+                    <a:prstGeom prst="rect">
+                      <a:avLst/>
+                    </a:prstGeom>
+                  </pic:spPr>
+                </pic:pic>
+              </a:graphicData>
+            </a:graphic>
+          </wp:inline>
+        </w:drawing>
       </w:r>
     </w:p>
     <w:sectPr>

</xml_diff>

<commit_message>
documenting the installation of DHCP and DNS servers
</commit_message>
<xml_diff>
--- a/New Microsoft Word Document.docx
+++ b/New Microsoft Word Document.docx
@@ -36,21 +36,7 @@
           <w:rPr>
             <w:rStyle w:val="Hyperlink"/>
           </w:rPr>
-          <w:t xml:space="preserve">Installing Active Directory on Windows </w:t>
-        </w:r>
-        <w:proofErr w:type="gramStart"/>
-        <w:r>
-          <w:rPr>
-            <w:rStyle w:val="Hyperlink"/>
-          </w:rPr>
-          <w:t>Server on</w:t>
-        </w:r>
-        <w:proofErr w:type="gramEnd"/>
-        <w:r>
-          <w:rPr>
-            <w:rStyle w:val="Hyperlink"/>
-          </w:rPr>
-          <w:t xml:space="preserve"> Virtual Machine (Home Lab) (Ep. 1)</w:t>
+          <w:t>Installing Active Directory on Windows Server on Virtual Machine (Home Lab) (Ep. 1)</w:t>
         </w:r>
       </w:hyperlink>
     </w:p>
@@ -108,21 +94,7 @@
           <w:rPr>
             <w:rStyle w:val="Hyperlink"/>
           </w:rPr>
-          <w:t xml:space="preserve">Installing Active Directory on Windows </w:t>
-        </w:r>
-        <w:proofErr w:type="gramStart"/>
-        <w:r>
-          <w:rPr>
-            <w:rStyle w:val="Hyperlink"/>
-          </w:rPr>
-          <w:t>Server on</w:t>
-        </w:r>
-        <w:proofErr w:type="gramEnd"/>
-        <w:r>
-          <w:rPr>
-            <w:rStyle w:val="Hyperlink"/>
-          </w:rPr>
-          <w:t xml:space="preserve"> Virtual Machine (Home Lab) (Ep. 1)</w:t>
+          <w:t>Installing Active Directory on Windows Server on Virtual Machine (Home Lab) (Ep. 1)</w:t>
         </w:r>
       </w:hyperlink>
     </w:p>
@@ -427,16 +399,11 @@
         <w:t xml:space="preserve"> </w:t>
       </w:r>
       <w:r>
-        <w:t xml:space="preserve">number of tries do you </w:t>
-      </w:r>
-      <w:proofErr w:type="gramStart"/>
-      <w:r>
-        <w:t xml:space="preserve">want </w:t>
+        <w:t xml:space="preserve">number of tries do you want </w:t>
       </w:r>
       <w:r>
         <w:t>.</w:t>
       </w:r>
-      <w:proofErr w:type="gramEnd"/>
     </w:p>
     <w:p/>
     <w:p>
@@ -599,15 +566,7 @@
     </w:p>
     <w:p>
       <w:r>
-        <w:t xml:space="preserve">On the client machine in the Ethernet config, keep the DHCP enabled, but in the DNS </w:t>
-      </w:r>
-      <w:proofErr w:type="gramStart"/>
-      <w:r>
-        <w:t>put it</w:t>
-      </w:r>
-      <w:proofErr w:type="gramEnd"/>
-      <w:r>
-        <w:t xml:space="preserve"> the same Static IP address of the server machine.</w:t>
+        <w:t>On the client machine in the Ethernet config, keep the DHCP enabled, but in the DNS put it the same Static IP address of the server machine.</w:t>
       </w:r>
     </w:p>
     <w:p>
@@ -683,12 +642,10 @@
         <w:t xml:space="preserve"> open the </w:t>
       </w:r>
       <w:proofErr w:type="spellStart"/>
-      <w:proofErr w:type="gramStart"/>
       <w:r>
         <w:t>domain.local</w:t>
       </w:r>
       <w:proofErr w:type="spellEnd"/>
-      <w:proofErr w:type="gramEnd"/>
       <w:r>
         <w:t xml:space="preserve"> and add new a or </w:t>
       </w:r>
@@ -719,18 +676,10 @@
     </w:p>
     <w:p>
       <w:r>
-        <w:t>Also</w:t>
-      </w:r>
-      <w:proofErr w:type="gramStart"/>
-      <w:r>
-        <w:t>,</w:t>
-      </w:r>
-      <w:r>
-        <w:t xml:space="preserve"> on the server</w:t>
-      </w:r>
-      <w:proofErr w:type="gramEnd"/>
-      <w:r>
-        <w:t xml:space="preserve"> put the </w:t>
+        <w:t>Also,</w:t>
+      </w:r>
+      <w:r>
+        <w:t xml:space="preserve"> on the server put the </w:t>
       </w:r>
       <w:r>
         <w:t>DNS</w:t>
@@ -755,15 +704,7 @@
         <w:t>Example:</w:t>
       </w:r>
       <w:r>
-        <w:t xml:space="preserve"> create a Policy to prevent access to control </w:t>
-      </w:r>
-      <w:proofErr w:type="gramStart"/>
-      <w:r>
-        <w:t>panel</w:t>
-      </w:r>
-      <w:proofErr w:type="gramEnd"/>
-      <w:r>
-        <w:t>.</w:t>
+        <w:t xml:space="preserve"> create a Policy to prevent access to control panel.</w:t>
       </w:r>
     </w:p>
     <w:p>
@@ -784,18 +725,10 @@
         <w:t xml:space="preserve"> -&gt; </w:t>
       </w:r>
       <w:r>
-        <w:t xml:space="preserve">control </w:t>
-      </w:r>
-      <w:proofErr w:type="gramStart"/>
-      <w:r>
-        <w:t xml:space="preserve">panel </w:t>
-      </w:r>
-      <w:r>
-        <w:t xml:space="preserve"> -</w:t>
-      </w:r>
-      <w:proofErr w:type="gramEnd"/>
-      <w:r>
-        <w:t xml:space="preserve">&gt; </w:t>
+        <w:t xml:space="preserve">control panel </w:t>
+      </w:r>
+      <w:r>
+        <w:t xml:space="preserve"> -&gt; </w:t>
       </w:r>
       <w:r>
         <w:t>Admin Templates</w:t>
@@ -894,15 +827,7 @@
         </w:numPr>
       </w:pPr>
       <w:r>
-        <w:t xml:space="preserve">Now client </w:t>
-      </w:r>
-      <w:proofErr w:type="gramStart"/>
-      <w:r>
-        <w:t>machine</w:t>
-      </w:r>
-      <w:proofErr w:type="gramEnd"/>
-      <w:r>
-        <w:t xml:space="preserve"> can’t have access to control panel</w:t>
+        <w:t>Now client machine can’t have access to control panel</w:t>
       </w:r>
     </w:p>
     <w:p>
@@ -1069,18 +994,10 @@
         <w:t xml:space="preserve"> go to file explorer</w:t>
       </w:r>
       <w:r>
-        <w:t xml:space="preserve"> on the Client </w:t>
-      </w:r>
-      <w:proofErr w:type="gramStart"/>
-      <w:r>
-        <w:t>PC</w:t>
-      </w:r>
-      <w:r>
-        <w:t xml:space="preserve"> ,</w:t>
-      </w:r>
-      <w:proofErr w:type="gramEnd"/>
-      <w:r>
-        <w:t xml:space="preserve"> then this PC , right click and select map network Driver.</w:t>
+        <w:t xml:space="preserve"> on the Client PC</w:t>
+      </w:r>
+      <w:r>
+        <w:t xml:space="preserve"> , then this PC , right click and select map network Driver.</w:t>
       </w:r>
     </w:p>
     <w:p>
@@ -1149,6 +1066,9 @@
     </w:p>
     <w:p>
       <w:r>
+        <w:rPr>
+          <w:noProof/>
+        </w:rPr>
         <w:drawing>
           <wp:inline distT="0" distB="0" distL="0" distR="0" wp14:anchorId="0ED3B978" wp14:editId="558301ED">
             <wp:extent cx="4865459" cy="3352800"/>
@@ -1197,13 +1117,8 @@
       </w:r>
     </w:p>
     <w:p>
-      <w:proofErr w:type="gramStart"/>
-      <w:r>
-        <w:t>In order to</w:t>
-      </w:r>
-      <w:proofErr w:type="gramEnd"/>
-      <w:r>
-        <w:t xml:space="preserve"> make the shared file appear all the time then follow Method 2.</w:t>
+      <w:r>
+        <w:t>In order to make the shared file appear all the time then follow Method 2.</w:t>
       </w:r>
     </w:p>
     <w:p>
@@ -1222,6 +1137,9 @@
     </w:p>
     <w:p>
       <w:r>
+        <w:rPr>
+          <w:noProof/>
+        </w:rPr>
         <w:drawing>
           <wp:inline distT="0" distB="0" distL="0" distR="0" wp14:anchorId="6DF206C0" wp14:editId="30972B1F">
             <wp:extent cx="4980804" cy="3981450"/>
@@ -1261,15 +1179,7 @@
     </w:p>
     <w:p>
       <w:r>
-        <w:t xml:space="preserve">Then on </w:t>
-      </w:r>
-      <w:proofErr w:type="gramStart"/>
-      <w:r>
-        <w:t>client ,</w:t>
-      </w:r>
-      <w:proofErr w:type="gramEnd"/>
-      <w:r>
-        <w:t xml:space="preserve"> open terminal then </w:t>
+        <w:t xml:space="preserve">Then on client , open terminal then </w:t>
       </w:r>
       <w:proofErr w:type="spellStart"/>
       <w:r>
@@ -1282,6 +1192,9 @@
     </w:p>
     <w:p>
       <w:r>
+        <w:rPr>
+          <w:noProof/>
+        </w:rPr>
         <w:drawing>
           <wp:inline distT="0" distB="0" distL="0" distR="0" wp14:anchorId="53ACEE69" wp14:editId="095F2685">
             <wp:extent cx="3978066" cy="3009900"/>
@@ -1327,15 +1240,7 @@
     </w:p>
     <w:p>
       <w:r>
-        <w:t xml:space="preserve">In server </w:t>
-      </w:r>
-      <w:proofErr w:type="gramStart"/>
-      <w:r>
-        <w:t>manager ,</w:t>
-      </w:r>
-      <w:proofErr w:type="gramEnd"/>
-      <w:r>
-        <w:t xml:space="preserve"> create </w:t>
+        <w:t xml:space="preserve">In server manager , create </w:t>
       </w:r>
       <w:r>
         <w:t xml:space="preserve">a new role or </w:t>
@@ -1351,6 +1256,9 @@
     </w:p>
     <w:p>
       <w:r>
+        <w:rPr>
+          <w:noProof/>
+        </w:rPr>
         <w:drawing>
           <wp:inline distT="0" distB="0" distL="0" distR="0" wp14:anchorId="0890AB32" wp14:editId="3D4DDF6F">
             <wp:extent cx="5943600" cy="4455795"/>
@@ -1402,15 +1310,7 @@
         <w:t>images, executables and</w:t>
       </w:r>
       <w:r>
-        <w:t xml:space="preserve"> videos </w:t>
-      </w:r>
-      <w:proofErr w:type="gramStart"/>
-      <w:r>
-        <w:t>to be</w:t>
-      </w:r>
-      <w:proofErr w:type="gramEnd"/>
-      <w:r>
-        <w:t xml:space="preserve"> added to the shared folder.</w:t>
+        <w:t xml:space="preserve"> videos to be added to the shared folder.</w:t>
       </w:r>
     </w:p>
     <w:p>
@@ -1444,6 +1344,9 @@
     </w:p>
     <w:p>
       <w:r>
+        <w:rPr>
+          <w:noProof/>
+        </w:rPr>
         <w:lastRenderedPageBreak/>
         <w:drawing>
           <wp:inline distT="0" distB="0" distL="0" distR="0" wp14:anchorId="424F6F7E" wp14:editId="0868B4DC">
@@ -1495,6 +1398,9 @@
     </w:p>
     <w:p>
       <w:r>
+        <w:rPr>
+          <w:noProof/>
+        </w:rPr>
         <w:lastRenderedPageBreak/>
         <w:drawing>
           <wp:inline distT="0" distB="0" distL="0" distR="0" wp14:anchorId="1017D9C8" wp14:editId="7036849E">
@@ -1540,6 +1446,9 @@
     </w:p>
     <w:p>
       <w:r>
+        <w:rPr>
+          <w:noProof/>
+        </w:rPr>
         <w:drawing>
           <wp:inline distT="0" distB="0" distL="0" distR="0" wp14:anchorId="1729E6A0" wp14:editId="3C74E9E3">
             <wp:extent cx="4953000" cy="3485621"/>
@@ -1577,6 +1486,166 @@
         </w:drawing>
       </w:r>
     </w:p>
+    <w:p/>
+    <w:p/>
+    <w:p>
+      <w:proofErr w:type="spellStart"/>
+      <w:r>
+        <w:lastRenderedPageBreak/>
+        <w:t>Configuation</w:t>
+      </w:r>
+      <w:proofErr w:type="spellEnd"/>
+      <w:r>
+        <w:t xml:space="preserve"> of DHCP server.</w:t>
+      </w:r>
+    </w:p>
+    <w:p>
+      <w:r>
+        <w:t xml:space="preserve">On </w:t>
+      </w:r>
+      <w:proofErr w:type="spellStart"/>
+      <w:r>
+        <w:t>servermanager</w:t>
+      </w:r>
+      <w:proofErr w:type="spellEnd"/>
+      <w:r>
+        <w:t xml:space="preserve"> . create new role or Feature.</w:t>
+      </w:r>
+    </w:p>
+    <w:p>
+      <w:r>
+        <w:t xml:space="preserve">Then select DHCP server and install it . </w:t>
+      </w:r>
+    </w:p>
+    <w:p>
+      <w:r>
+        <w:t>PS</w:t>
+      </w:r>
+      <w:r>
+        <w:t>: if it says a w</w:t>
+      </w:r>
+      <w:r>
+        <w:t xml:space="preserve">arning that the pc doesn’t have a static </w:t>
+      </w:r>
+      <w:proofErr w:type="spellStart"/>
+      <w:r>
+        <w:t>ip</w:t>
+      </w:r>
+      <w:proofErr w:type="spellEnd"/>
+      <w:r>
+        <w:t xml:space="preserve"> , then configure it from </w:t>
+      </w:r>
+      <w:proofErr w:type="spellStart"/>
+      <w:r>
+        <w:t>ncpa.cpl</w:t>
+      </w:r>
+      <w:proofErr w:type="spellEnd"/>
+      <w:r>
+        <w:t xml:space="preserve"> and restart. Then install DHCP server </w:t>
+      </w:r>
+    </w:p>
+    <w:p>
+      <w:r>
+        <w:t>After the installation is completed, click on configure credentials and then commit.</w:t>
+      </w:r>
+    </w:p>
+    <w:p/>
+    <w:p>
+      <w:r>
+        <w:t xml:space="preserve">Now on Server manager select tools -&gt; DHCP </w:t>
+      </w:r>
+    </w:p>
+    <w:p>
+      <w:r>
+        <w:t>DHCP manager will pop up, select IPV4</w:t>
+      </w:r>
+    </w:p>
+    <w:p>
+      <w:r>
+        <w:t xml:space="preserve">Add scope . follow up by clicking next and fill the relevant </w:t>
+      </w:r>
+      <w:proofErr w:type="spellStart"/>
+      <w:r>
+        <w:t>informations</w:t>
+      </w:r>
+      <w:proofErr w:type="spellEnd"/>
+      <w:r>
+        <w:t>.</w:t>
+      </w:r>
+    </w:p>
+    <w:p>
+      <w:r>
+        <w:t xml:space="preserve">PS </w:t>
+      </w:r>
+      <w:r>
+        <w:t>: if your internet m</w:t>
+      </w:r>
+      <w:r>
+        <w:t xml:space="preserve">ask is 24 it mean you can have 2 in power if 8 – 2 devices (basically 252 device) and usually the </w:t>
+      </w:r>
+      <w:proofErr w:type="spellStart"/>
+      <w:r>
+        <w:t>fist</w:t>
+      </w:r>
+      <w:proofErr w:type="spellEnd"/>
+      <w:r>
+        <w:t xml:space="preserve"> 1-99 </w:t>
+      </w:r>
+      <w:proofErr w:type="spellStart"/>
+      <w:r>
+        <w:t>ip</w:t>
+      </w:r>
+      <w:proofErr w:type="spellEnd"/>
+      <w:r>
+        <w:t xml:space="preserve"> addresses are static for devices that should not change IP address , like router, printer, Windows Server </w:t>
+      </w:r>
+      <w:proofErr w:type="spellStart"/>
+      <w:r>
+        <w:t>usw</w:t>
+      </w:r>
+      <w:proofErr w:type="spellEnd"/>
+      <w:r>
+        <w:t>.</w:t>
+      </w:r>
+    </w:p>
+    <w:p>
+      <w:r>
+        <w:t>Then make sure to activate the scope.</w:t>
+      </w:r>
+    </w:p>
+    <w:p/>
+    <w:p>
+      <w:pPr>
+        <w:rPr>
+          <w:lang w:val="de-DE"/>
+        </w:rPr>
+      </w:pPr>
+      <w:r>
+        <w:t xml:space="preserve">Installing </w:t>
+      </w:r>
+      <w:proofErr w:type="spellStart"/>
+      <w:r>
+        <w:t>dns</w:t>
+      </w:r>
+      <w:proofErr w:type="spellEnd"/>
+      <w:r>
+        <w:t xml:space="preserve"> server</w:t>
+      </w:r>
+      <w:r>
+        <w:rPr>
+          <w:lang w:val="de-DE"/>
+        </w:rPr>
+        <w:t>:</w:t>
+      </w:r>
+    </w:p>
+    <w:p>
+      <w:pPr>
+        <w:rPr>
+          <w:lang w:val="de-DE"/>
+        </w:rPr>
+      </w:pPr>
+    </w:p>
+    <w:p/>
     <w:sectPr>
       <w:pgSz w:w="12240" w:h="15840"/>
       <w:pgMar w:top="1440" w:right="1440" w:bottom="1440" w:left="1440" w:header="720" w:footer="720" w:gutter="0"/>
@@ -2404,6 +2473,7 @@
   <w:style w:type="character" w:default="1" w:styleId="DefaultParagraphFont">
     <w:name w:val="Default Paragraph Font"/>
     <w:uiPriority w:val="1"/>
+    <w:semiHidden/>
     <w:unhideWhenUsed/>
   </w:style>
   <w:style w:type="table" w:default="1" w:styleId="TableNormal">

</xml_diff>